<commit_message>
feat: adiciona balancete anual analitico
</commit_message>
<xml_diff>
--- a/downloads/Manual_Operacional_CCI.docx
+++ b/downloads/Manual_Operacional_CCI.docx
@@ -55,7 +55,7 @@
           <w:color w:val="64748B"/>
           <w:sz w:val="20"/>
         </w:rPr>
-        <w:t>Versão 2.0  |  18 de agosto de 2026  |  Uso interno</w:t>
+        <w:t>Versão 2.1  |  18 de agosto de 2026  |  Uso interno</w:t>
       </w:r>
     </w:p>
     <w:p/>
@@ -456,7 +456,7 @@
               <w:jc w:val="left"/>
             </w:pPr>
             <w:r>
-              <w:t>Balancete, Razão, Diário, DRE, Balanço e análise econômico-financeira.</w:t>
+              <w:t>Balancete mensal e anual, Razão, Diário, DRE, Balanço e análise econômico-financeira.</w:t>
             </w:r>
           </w:p>
         </w:tc>
@@ -878,6 +878,18 @@
     </w:p>
     <w:p>
       <w:pPr>
+        <w:spacing w:after="80" w:line="300" w:lineRule="auto"/>
+        <w:numPr>
+          <w:ilvl w:val="0"/>
+          <w:numId w:val="10"/>
+        </w:numPr>
+      </w:pPr>
+      <w:r>
+        <w:t>Balancete Anual Analítico, com hierarquia do plano de contas, saldos de janeiro a dezembro, resumo e exportações em PDF e Excel.</w:t>
+      </w:r>
+    </w:p>
+    <w:p>
+      <w:pPr>
         <w:pStyle w:val="Heading1"/>
       </w:pPr>
       <w:r>
@@ -1029,7 +1041,7 @@
         </w:numPr>
       </w:pPr>
       <w:r>
-        <w:t>Emitir Balancete, Razão, Diário, DRE, Balanço e análises para revisão.</w:t>
+        <w:t>Emitir Balancete mensal ou anual, Razão, Diário, DRE, Balanço e análises para revisão.</w:t>
       </w:r>
     </w:p>
     <w:p>
@@ -1307,7 +1319,7 @@
         <w:ind w:left="270"/>
       </w:pPr>
       <w:r>
-        <w:t>☐ Balancete, Razão, Diário, DRE e Balanço revisados.</w:t>
+        <w:t>☐ Balancete mensal ou anual, Razão, Diário, DRE e Balanço revisados.</w:t>
       </w:r>
     </w:p>
     <w:p>
@@ -1422,6 +1434,51 @@
             </w:pPr>
             <w:r>
               <w:t>Conferir saldos anteriores, débitos, créditos e saldos atuais pela estrutura de contas.</w:t>
+            </w:r>
+          </w:p>
+        </w:tc>
+      </w:tr>
+      <w:tr>
+        <w:trPr>
+          <w:cantSplit/>
+        </w:trPr>
+        <w:tc>
+          <w:tcPr>
+            <w:tcW w:type="dxa" w:w="4680"/>
+            <w:vAlign w:val="center"/>
+            <w:tcMar>
+              <w:top w:w="80" w:type="dxa"/>
+              <w:start w:w="120" w:type="dxa"/>
+              <w:bottom w:w="80" w:type="dxa"/>
+              <w:end w:w="120" w:type="dxa"/>
+            </w:tcMar>
+          </w:tcPr>
+          <w:p>
+            <w:pPr>
+              <w:jc w:val="left"/>
+            </w:pPr>
+            <w:r>
+              <w:t>Balancete Anual</w:t>
+            </w:r>
+          </w:p>
+        </w:tc>
+        <w:tc>
+          <w:tcPr>
+            <w:tcW w:type="dxa" w:w="4680"/>
+            <w:vAlign w:val="center"/>
+            <w:tcMar>
+              <w:top w:w="80" w:type="dxa"/>
+              <w:start w:w="120" w:type="dxa"/>
+              <w:bottom w:w="80" w:type="dxa"/>
+              <w:end w:w="120" w:type="dxa"/>
+            </w:tcMar>
+          </w:tcPr>
+          <w:p>
+            <w:pPr>
+              <w:jc w:val="left"/>
+            </w:pPr>
+            <w:r>
+              <w:t>Comparar os saldos finais de janeiro a dezembro, com transporte mensal, hierarquia do plano e resumo por grupos.</w:t>
             </w:r>
           </w:p>
         </w:tc>
@@ -2990,7 +3047,7 @@
       <w:rPr>
         <w:sz w:val="16"/>
       </w:rPr>
-      <w:t>Uso interno  •  v2.0  •  18/08/2026</w:t>
+      <w:t>Uso interno  •  v2.1  •  18/08/2026</w:t>
     </w:r>
   </w:p>
 </w:ftr>
@@ -3475,6 +3532,7 @@
       <w:keepNext/>
       <w:keepLines/>
       <w:spacing w:before="360" w:after="200"/>
+      <w:ind w:left="0" w:firstLine="0"/>
       <w:outlineLvl w:val="0"/>
     </w:pPr>
     <w:rPr>
@@ -3499,6 +3557,7 @@
       <w:keepNext/>
       <w:keepLines/>
       <w:spacing w:before="280" w:after="140"/>
+      <w:ind w:left="0" w:firstLine="0"/>
       <w:outlineLvl w:val="1"/>
     </w:pPr>
     <w:rPr>
@@ -3523,6 +3582,7 @@
       <w:keepNext/>
       <w:keepLines/>
       <w:spacing w:before="200" w:after="100"/>
+      <w:ind w:left="0" w:firstLine="0"/>
       <w:outlineLvl w:val="2"/>
     </w:pPr>
     <w:rPr>

</xml_diff>

<commit_message>
feat: adiciona alteracao segura em lote
</commit_message>
<xml_diff>
--- a/downloads/Manual_Operacional_CCI.docx
+++ b/downloads/Manual_Operacional_CCI.docx
@@ -55,7 +55,7 @@
           <w:color w:val="64748B"/>
           <w:sz w:val="20"/>
         </w:rPr>
-        <w:t>Versão 2.1  |  18 de agosto de 2026  |  Uso interno</w:t>
+        <w:t>Versão 2.2  |  18 de agosto de 2026  |  Uso interno</w:t>
       </w:r>
     </w:p>
     <w:p/>
@@ -890,6 +890,18 @@
     </w:p>
     <w:p>
       <w:pPr>
+        <w:spacing w:after="80" w:line="300" w:lineRule="auto"/>
+        <w:numPr>
+          <w:ilvl w:val="0"/>
+          <w:numId w:val="10"/>
+        </w:numPr>
+      </w:pPr>
+      <w:r>
+        <w:t>Alteração explícita de classificações em lote, com seleção dos campos, confirmação, travas por natureza e auditoria do usuário.</w:t>
+      </w:r>
+    </w:p>
+    <w:p>
+      <w:pPr>
         <w:pStyle w:val="Heading1"/>
       </w:pPr>
       <w:r>
@@ -1217,6 +1229,30 @@
       </w:pPr>
       <w:r>
         <w:t>Revisar sentido bancário e natureza da operação antes de memorizar.</w:t>
+      </w:r>
+    </w:p>
+    <w:p>
+      <w:pPr>
+        <w:spacing w:after="80" w:line="300" w:lineRule="auto"/>
+        <w:numPr>
+          <w:ilvl w:val="0"/>
+          <w:numId w:val="10"/>
+        </w:numPr>
+      </w:pPr>
+      <w:r>
+        <w:t>Para alterar duas ou mais linhas, marque os lançamentos e use Alterar selecionados; escolha somente os campos que serão replicados e confirme a quantidade.</w:t>
+      </w:r>
+    </w:p>
+    <w:p>
+      <w:pPr>
+        <w:spacing w:after="80" w:line="300" w:lineRule="auto"/>
+        <w:numPr>
+          <w:ilvl w:val="0"/>
+          <w:numId w:val="10"/>
+        </w:numPr>
+      </w:pPr>
+      <w:r>
+        <w:t>A alteração em lote preserva data, valor, descrição e documento. Contas só podem ser aplicadas quando todos os selecionados tiverem a mesma natureza.</w:t>
       </w:r>
     </w:p>
     <w:p>
@@ -3047,7 +3083,7 @@
       <w:rPr>
         <w:sz w:val="16"/>
       </w:rPr>
-      <w:t>Uso interno  •  v2.1  •  18/08/2026</w:t>
+      <w:t>Uso interno  •  v2.2  •  18/08/2026</w:t>
     </w:r>
   </w:p>
 </w:ftr>

</xml_diff>

<commit_message>
feat: importar demonstrativo SAGE de impostos retidos
</commit_message>
<xml_diff>
--- a/downloads/Manual_Operacional_CCI.docx
+++ b/downloads/Manual_Operacional_CCI.docx
@@ -55,7 +55,7 @@
           <w:color w:val="64748B"/>
           <w:sz w:val="20"/>
         </w:rPr>
-        <w:t>Versão 2.2  |  18 de agosto de 2026  |  Uso interno</w:t>
+        <w:t>Versão 2.3  |  18 de agosto de 2026  |  Uso interno</w:t>
       </w:r>
     </w:p>
     <w:p/>
@@ -1177,6 +1177,113 @@
             </w:r>
             <w:r>
               <w:t>Os movimentos confirmados permanecem na base da empresa, podem ser consultados e alimentam os relatórios. Exportar para a SAGE não consome nem apaga esses lançamentos.</w:t>
+            </w:r>
+          </w:p>
+        </w:tc>
+      </w:tr>
+    </w:tbl>
+    <w:p>
+      <w:pPr>
+        <w:spacing w:after="0"/>
+      </w:pPr>
+    </w:p>
+    <w:p>
+      <w:pPr>
+        <w:pStyle w:val="Heading1"/>
+      </w:pPr>
+      <w:r>
+        <w:t>5A. Importação de movimento fiscal</w:t>
+      </w:r>
+    </w:p>
+    <w:p>
+      <w:pPr>
+        <w:spacing w:after="80" w:line="300" w:lineRule="auto"/>
+        <w:ind w:left="270"/>
+      </w:pPr>
+      <w:r>
+        <w:t>☐ Ativar a empresa correta e conferir o CNPJ antes de selecionar o arquivo.</w:t>
+      </w:r>
+    </w:p>
+    <w:p>
+      <w:pPr>
+        <w:spacing w:after="80" w:line="300" w:lineRule="auto"/>
+        <w:ind w:left="270"/>
+      </w:pPr>
+      <w:r>
+        <w:t>☐ Abrir Importações - Movimento Fiscal e escolher o modelo correspondente ao relatório.</w:t>
+      </w:r>
+    </w:p>
+    <w:p>
+      <w:pPr>
+        <w:spacing w:after="80" w:line="300" w:lineRule="auto"/>
+        <w:ind w:left="270"/>
+      </w:pPr>
+      <w:r>
+        <w:t>☐ Para o Demonstrativo de Impostos Retidos da SAGE, usar o modelo geral Impostos retidos em notas de serviços.</w:t>
+      </w:r>
+    </w:p>
+    <w:p>
+      <w:pPr>
+        <w:spacing w:after="80" w:line="300" w:lineRule="auto"/>
+        <w:ind w:left="270"/>
+      </w:pPr>
+      <w:r>
+        <w:t>☐ Conferir período, quantidade de notas, valor total, base de retenção, PIS, COFINS, CSLL, IRRF e INSS.</w:t>
+      </w:r>
+    </w:p>
+    <w:p>
+      <w:pPr>
+        <w:spacing w:after="80" w:line="300" w:lineRule="auto"/>
+        <w:ind w:left="270"/>
+      </w:pPr>
+      <w:r>
+        <w:t>☐ Não continuar se o CNPJ do cabeçalho divergir da empresa ativa ou se qualquer total oficial não fechar.</w:t>
+      </w:r>
+    </w:p>
+    <w:p>
+      <w:pPr>
+        <w:spacing w:after="80" w:line="300" w:lineRule="auto"/>
+        <w:ind w:left="270"/>
+      </w:pPr>
+      <w:r>
+        <w:t>☐ Revisar a prévia antes de confirmar a gravação dos lançamentos.</w:t>
+      </w:r>
+    </w:p>
+    <w:tbl>
+      <w:tblPr>
+        <w:tblW w:type="dxa" w:w="9360"/>
+        <w:tblLayout w:type="fixed"/>
+        <w:tblLook w:firstColumn="1" w:firstRow="1" w:lastColumn="0" w:lastRow="0" w:noHBand="0" w:noVBand="1" w:val="04A0"/>
+        <w:tblInd w:w="120" w:type="dxa"/>
+      </w:tblPr>
+      <w:tblGrid>
+        <w:gridCol w:w="9360"/>
+      </w:tblGrid>
+      <w:tr>
+        <w:trPr>
+          <w:cantSplit/>
+        </w:trPr>
+        <w:tc>
+          <w:tcPr>
+            <w:tcW w:type="dxa" w:w="9360"/>
+            <w:tcMar>
+              <w:top w:w="80" w:type="dxa"/>
+              <w:start w:w="120" w:type="dxa"/>
+              <w:bottom w:w="80" w:type="dxa"/>
+              <w:end w:w="120" w:type="dxa"/>
+            </w:tcMar>
+            <w:shd w:fill="EFF6FF"/>
+          </w:tcPr>
+          <w:p>
+            <w:r>
+              <w:rPr>
+                <w:b/>
+                <w:color w:val="2454D7"/>
+              </w:rPr>
+              <w:t xml:space="preserve">Modelo geral: </w:t>
+            </w:r>
+            <w:r>
+              <w:t>O código e o nome da empresa impressos no relatório são informativos. A liberação depende do CNPJ do cabeçalho ser idêntico ao cadastro da empresa ativa e de todos os totais oficiais estarem conciliados.</w:t>
             </w:r>
           </w:p>
         </w:tc>
@@ -3083,7 +3190,7 @@
       <w:rPr>
         <w:sz w:val="16"/>
       </w:rPr>
-      <w:t>Uso interno  •  v2.2  •  18/08/2026</w:t>
+      <w:t>Uso interno  •  v2.3  •  18/08/2026</w:t>
     </w:r>
   </w:p>
 </w:ftr>

</xml_diff>

<commit_message>
fix: processar extrato BB escaneado sem Gemini
</commit_message>
<xml_diff>
--- a/downloads/Manual_Operacional_CCI.docx
+++ b/downloads/Manual_Operacional_CCI.docx
@@ -55,7 +55,7 @@
           <w:color w:val="64748B"/>
           <w:sz w:val="20"/>
         </w:rPr>
-        <w:t>Versão 2.3  |  18 de agosto de 2026  |  Uso interno</w:t>
+        <w:t>Versão 2.4  |  18 de agosto de 2026  |  Uso interno</w:t>
       </w:r>
     </w:p>
     <w:p/>
@@ -1112,6 +1112,15 @@
         <w:ind w:left="270"/>
       </w:pPr>
       <w:r>
+        <w:t>☐ No Banco do Brasil, o leiaute Extrato de Conta Corrente (+/-) aceita PDF textual ou escaneado e executa OCR local, sem depender de créditos do Gemini.</w:t>
+      </w:r>
+    </w:p>
+    <w:p>
+      <w:pPr>
+        <w:spacing w:after="80" w:line="300" w:lineRule="auto"/>
+        <w:ind w:left="270"/>
+      </w:pPr>
+      <w:r>
         <w:t>☐ Conferir período, conta bancária, quantidade de movimentos e totais.</w:t>
       </w:r>
     </w:p>
@@ -1177,6 +1186,51 @@
             </w:r>
             <w:r>
               <w:t>Os movimentos confirmados permanecem na base da empresa, podem ser consultados e alimentam os relatórios. Exportar para a SAGE não consome nem apaga esses lançamentos.</w:t>
+            </w:r>
+          </w:p>
+        </w:tc>
+      </w:tr>
+    </w:tbl>
+    <w:p>
+      <w:pPr>
+        <w:spacing w:after="0"/>
+      </w:pPr>
+    </w:p>
+    <w:tbl>
+      <w:tblPr>
+        <w:tblW w:type="dxa" w:w="9360"/>
+        <w:tblLayout w:type="fixed"/>
+        <w:tblLook w:firstColumn="1" w:firstRow="1" w:lastColumn="0" w:lastRow="0" w:noHBand="0" w:noVBand="1" w:val="04A0"/>
+        <w:tblInd w:w="120" w:type="dxa"/>
+      </w:tblPr>
+      <w:tblGrid>
+        <w:gridCol w:w="9360"/>
+      </w:tblGrid>
+      <w:tr>
+        <w:trPr>
+          <w:cantSplit/>
+        </w:trPr>
+        <w:tc>
+          <w:tcPr>
+            <w:tcW w:type="dxa" w:w="9360"/>
+            <w:tcMar>
+              <w:top w:w="80" w:type="dxa"/>
+              <w:start w:w="120" w:type="dxa"/>
+              <w:bottom w:w="80" w:type="dxa"/>
+              <w:end w:w="120" w:type="dxa"/>
+            </w:tcMar>
+            <w:shd w:fill="FFF7ED"/>
+          </w:tcPr>
+          <w:p>
+            <w:r>
+              <w:rPr>
+                <w:b/>
+                <w:color w:val="9A3412"/>
+              </w:rPr>
+              <w:t xml:space="preserve">Trava do Banco do Brasil: </w:t>
+            </w:r>
+            <w:r>
+              <w:t>Em PDF escaneado, o CCI reconstrói as linhas pela posição das palavras. A importação permanece bloqueada se saldo anterior + créditos - débitos não coincidir exatamente com o saldo final impresso.</w:t>
             </w:r>
           </w:p>
         </w:tc>
@@ -3190,7 +3244,7 @@
       <w:rPr>
         <w:sz w:val="16"/>
       </w:rPr>
-      <w:t>Uso interno  •  v2.3  •  18/08/2026</w:t>
+      <w:t>Uso interno  •  v2.4  •  18/08/2026</w:t>
     </w:r>
   </w:p>
 </w:ftr>

</xml_diff>

<commit_message>
fix: incluir impostos retidos do demonstrativo SAGE
</commit_message>
<xml_diff>
--- a/downloads/Manual_Operacional_CCI.docx
+++ b/downloads/Manual_Operacional_CCI.docx
@@ -55,7 +55,7 @@
           <w:color w:val="64748B"/>
           <w:sz w:val="20"/>
         </w:rPr>
-        <w:t>Versão 2.4  |  18 de agosto de 2026  |  Uso interno</w:t>
+        <w:t>Versão 2.5  |  18 de agosto de 2026  |  Uso interno</w:t>
       </w:r>
     </w:p>
     <w:p/>
@@ -902,6 +902,18 @@
     </w:p>
     <w:p>
       <w:pPr>
+        <w:spacing w:after="80" w:line="300" w:lineRule="auto"/>
+        <w:numPr>
+          <w:ilvl w:val="0"/>
+          <w:numId w:val="10"/>
+        </w:numPr>
+      </w:pPr>
+      <w:r>
+        <w:t>Demonstrativo SAGE de impostos retidos com linha bruta e linhas separadas de PIS, COFINS, CSLL, IRRF e INSS quando houver valor.</w:t>
+      </w:r>
+    </w:p>
+    <w:p>
+      <w:pPr>
         <w:pStyle w:val="Heading1"/>
       </w:pPr>
       <w:r>
@@ -1282,7 +1294,25 @@
         <w:ind w:left="270"/>
       </w:pPr>
       <w:r>
-        <w:t>☐ Conferir período, quantidade de notas, valor total, base de retenção, PIS, COFINS, CSLL, IRRF e INSS.</w:t>
+        <w:t>☐ Conferir período, quantidade de notas, valor bruto, base de retenção, PIS, COFINS, CSLL, IRRF, INSS, total retido e valor líquido.</w:t>
+      </w:r>
+    </w:p>
+    <w:p>
+      <w:pPr>
+        <w:spacing w:after="80" w:line="300" w:lineRule="auto"/>
+        <w:ind w:left="270"/>
+      </w:pPr>
+      <w:r>
+        <w:t>☐ Na prévia, cada nota gera uma linha de valor bruto e uma linha para cada imposto retido com valor diferente de zero. Impostos zerados permanecem nos dados de origem, sem criar lançamento contábil artificial.</w:t>
+      </w:r>
+    </w:p>
+    <w:p>
+      <w:pPr>
+        <w:spacing w:after="80" w:line="300" w:lineRule="auto"/>
+        <w:ind w:left="270"/>
+      </w:pPr>
+      <w:r>
+        <w:t>☐ Número e modelo da NF, série, tomador, base de retenção e data de compensação acompanham as linhas geradas.</w:t>
       </w:r>
     </w:p>
     <w:p>
@@ -1338,6 +1368,51 @@
             </w:r>
             <w:r>
               <w:t>O código e o nome da empresa impressos no relatório são informativos. A liberação depende do CNPJ do cabeçalho ser idêntico ao cadastro da empresa ativa e de todos os totais oficiais estarem conciliados.</w:t>
+            </w:r>
+          </w:p>
+        </w:tc>
+      </w:tr>
+    </w:tbl>
+    <w:p>
+      <w:pPr>
+        <w:spacing w:after="0"/>
+      </w:pPr>
+    </w:p>
+    <w:tbl>
+      <w:tblPr>
+        <w:tblW w:type="dxa" w:w="9360"/>
+        <w:tblLayout w:type="fixed"/>
+        <w:tblLook w:firstColumn="1" w:firstRow="1" w:lastColumn="0" w:lastRow="0" w:noHBand="0" w:noVBand="1" w:val="04A0"/>
+        <w:tblInd w:w="120" w:type="dxa"/>
+      </w:tblPr>
+      <w:tblGrid>
+        <w:gridCol w:w="9360"/>
+      </w:tblGrid>
+      <w:tr>
+        <w:trPr>
+          <w:cantSplit/>
+        </w:trPr>
+        <w:tc>
+          <w:tcPr>
+            <w:tcW w:type="dxa" w:w="9360"/>
+            <w:tcMar>
+              <w:top w:w="80" w:type="dxa"/>
+              <w:start w:w="120" w:type="dxa"/>
+              <w:bottom w:w="80" w:type="dxa"/>
+              <w:end w:w="120" w:type="dxa"/>
+            </w:tcMar>
+            <w:shd w:fill="FFF7ED"/>
+          </w:tcPr>
+          <w:p>
+            <w:r>
+              <w:rPr>
+                <w:b/>
+                <w:color w:val="9A3412"/>
+              </w:rPr>
+              <w:t xml:space="preserve">Classificação contábil: </w:t>
+            </w:r>
+            <w:r>
+              <w:t>O CCI não inventa contas para os impostos. Débito, crédito e histórico devem vir do plano e das regras aprovadas para a empresa; somente depois a classificação pode ser memorizada.</w:t>
             </w:r>
           </w:p>
         </w:tc>
@@ -3244,7 +3319,7 @@
       <w:rPr>
         <w:sz w:val="16"/>
       </w:rPr>
-      <w:t>Uso interno  •  v2.4  •  18/08/2026</w:t>
+      <w:t>Uso interno  •  v2.5  •  18/08/2026</w:t>
     </w:r>
   </w:p>
 </w:ftr>

</xml_diff>

<commit_message>
feat: adicionar retencoes de servicos tomados
</commit_message>
<xml_diff>
--- a/downloads/Manual_Operacional_CCI.docx
+++ b/downloads/Manual_Operacional_CCI.docx
@@ -55,7 +55,7 @@
           <w:color w:val="64748B"/>
           <w:sz w:val="20"/>
         </w:rPr>
-        <w:t>Versão 2.5  |  18 de agosto de 2026  |  Uso interno</w:t>
+        <w:t>Versão 2.6  |  18 de agosto de 2026  |  Uso interno</w:t>
       </w:r>
     </w:p>
     <w:p/>
@@ -283,6 +283,7 @@
           </w:tcPr>
           <w:p>
             <w:pPr>
+              <w:ind w:left="0" w:firstLine="0"/>
               <w:jc w:val="left"/>
             </w:pPr>
             <w:r>
@@ -303,6 +304,7 @@
           </w:tcPr>
           <w:p>
             <w:pPr>
+              <w:ind w:left="0" w:firstLine="0"/>
               <w:jc w:val="left"/>
             </w:pPr>
             <w:r>
@@ -323,6 +325,7 @@
           </w:tcPr>
           <w:p>
             <w:pPr>
+              <w:ind w:left="0" w:firstLine="0"/>
               <w:jc w:val="left"/>
             </w:pPr>
             <w:r>
@@ -348,6 +351,7 @@
           </w:tcPr>
           <w:p>
             <w:pPr>
+              <w:ind w:left="0" w:firstLine="0"/>
               <w:jc w:val="left"/>
             </w:pPr>
             <w:r>
@@ -368,6 +372,7 @@
           </w:tcPr>
           <w:p>
             <w:pPr>
+              <w:ind w:left="0" w:firstLine="0"/>
               <w:jc w:val="left"/>
             </w:pPr>
             <w:r>
@@ -388,6 +393,7 @@
           </w:tcPr>
           <w:p>
             <w:pPr>
+              <w:ind w:left="0" w:firstLine="0"/>
               <w:jc w:val="left"/>
             </w:pPr>
             <w:r>
@@ -413,6 +419,7 @@
           </w:tcPr>
           <w:p>
             <w:pPr>
+              <w:ind w:left="0" w:firstLine="0"/>
               <w:jc w:val="left"/>
             </w:pPr>
             <w:r>
@@ -433,6 +440,7 @@
           </w:tcPr>
           <w:p>
             <w:pPr>
+              <w:ind w:left="0" w:firstLine="0"/>
               <w:jc w:val="left"/>
             </w:pPr>
             <w:r>
@@ -453,6 +461,7 @@
           </w:tcPr>
           <w:p>
             <w:pPr>
+              <w:ind w:left="0" w:firstLine="0"/>
               <w:jc w:val="left"/>
             </w:pPr>
             <w:r>
@@ -478,6 +487,7 @@
           </w:tcPr>
           <w:p>
             <w:pPr>
+              <w:ind w:left="0" w:firstLine="0"/>
               <w:jc w:val="left"/>
             </w:pPr>
             <w:r>
@@ -498,6 +508,7 @@
           </w:tcPr>
           <w:p>
             <w:pPr>
+              <w:ind w:left="0" w:firstLine="0"/>
               <w:jc w:val="left"/>
             </w:pPr>
             <w:r>
@@ -518,6 +529,7 @@
           </w:tcPr>
           <w:p>
             <w:pPr>
+              <w:ind w:left="0" w:firstLine="0"/>
               <w:jc w:val="left"/>
             </w:pPr>
             <w:r>
@@ -543,6 +555,7 @@
           </w:tcPr>
           <w:p>
             <w:pPr>
+              <w:ind w:left="0" w:firstLine="0"/>
               <w:jc w:val="left"/>
             </w:pPr>
             <w:r>
@@ -563,6 +576,7 @@
           </w:tcPr>
           <w:p>
             <w:pPr>
+              <w:ind w:left="0" w:firstLine="0"/>
               <w:jc w:val="left"/>
             </w:pPr>
             <w:r>
@@ -583,6 +597,7 @@
           </w:tcPr>
           <w:p>
             <w:pPr>
+              <w:ind w:left="0" w:firstLine="0"/>
               <w:jc w:val="left"/>
             </w:pPr>
             <w:r>
@@ -608,6 +623,7 @@
           </w:tcPr>
           <w:p>
             <w:pPr>
+              <w:ind w:left="0" w:firstLine="0"/>
               <w:jc w:val="left"/>
             </w:pPr>
             <w:r>
@@ -628,6 +644,7 @@
           </w:tcPr>
           <w:p>
             <w:pPr>
+              <w:ind w:left="0" w:firstLine="0"/>
               <w:jc w:val="left"/>
             </w:pPr>
             <w:r>
@@ -648,6 +665,7 @@
           </w:tcPr>
           <w:p>
             <w:pPr>
+              <w:ind w:left="0" w:firstLine="0"/>
               <w:jc w:val="left"/>
             </w:pPr>
             <w:r>
@@ -673,6 +691,7 @@
           </w:tcPr>
           <w:p>
             <w:pPr>
+              <w:ind w:left="0" w:firstLine="0"/>
               <w:jc w:val="left"/>
             </w:pPr>
             <w:r>
@@ -693,6 +712,7 @@
           </w:tcPr>
           <w:p>
             <w:pPr>
+              <w:ind w:left="0" w:firstLine="0"/>
               <w:jc w:val="left"/>
             </w:pPr>
             <w:r>
@@ -713,6 +733,7 @@
           </w:tcPr>
           <w:p>
             <w:pPr>
+              <w:ind w:left="0" w:firstLine="0"/>
               <w:jc w:val="left"/>
             </w:pPr>
             <w:r>
@@ -909,7 +930,19 @@
         </w:numPr>
       </w:pPr>
       <w:r>
-        <w:t>Demonstrativo SAGE de impostos retidos com linha bruta e linhas separadas de PIS, COFINS, CSLL, IRRF e INSS quando houver valor.</w:t>
+        <w:t>Demonstrativo SAGE de impostos retidos em serviços prestados com linha bruta e linhas separadas de PIS, COFINS, CSLL, IRRF e INSS quando houver valor.</w:t>
+      </w:r>
+    </w:p>
+    <w:p>
+      <w:pPr>
+        <w:spacing w:after="80" w:line="300" w:lineRule="auto"/>
+        <w:numPr>
+          <w:ilvl w:val="0"/>
+          <w:numId w:val="10"/>
+        </w:numPr>
+      </w:pPr>
+      <w:r>
+        <w:t>Novo modal Retenções de Serviços Tomados, disponível para todas as empresas, com leitura do relatório SAGE de notas de entradas de serviços.</w:t>
       </w:r>
     </w:p>
     <w:p>
@@ -1294,6 +1327,24 @@
         <w:ind w:left="270"/>
       </w:pPr>
       <w:r>
+        <w:t>☐ Para retenções sobre serviços tomados, abrir o modal independente Retenções Serviços Tomados. Ele está disponível para qualquer empresa ativa e aceita o Demonstrativo dos Impostos Retidos - Notas de Entradas de Serviços em PDF.</w:t>
+      </w:r>
+    </w:p>
+    <w:p>
+      <w:pPr>
+        <w:spacing w:after="80" w:line="300" w:lineRule="auto"/>
+        <w:ind w:left="270"/>
+      </w:pPr>
+      <w:r>
+        <w:t>☐ No novo modal, validar o CNPJ, o período, a quantidade de notas, o valor bruto, o total retido e o valor líquido antes de continuar para a prévia.</w:t>
+      </w:r>
+    </w:p>
+    <w:p>
+      <w:pPr>
+        <w:spacing w:after="80" w:line="300" w:lineRule="auto"/>
+        <w:ind w:left="270"/>
+      </w:pPr>
+      <w:r>
         <w:t>☐ Conferir período, quantidade de notas, valor bruto, base de retenção, PIS, COFINS, CSLL, IRRF, INSS, total retido e valor líquido.</w:t>
       </w:r>
     </w:p>
@@ -1368,6 +1419,51 @@
             </w:r>
             <w:r>
               <w:t>O código e o nome da empresa impressos no relatório são informativos. A liberação depende do CNPJ do cabeçalho ser idêntico ao cadastro da empresa ativa e de todos os totais oficiais estarem conciliados.</w:t>
+            </w:r>
+          </w:p>
+        </w:tc>
+      </w:tr>
+    </w:tbl>
+    <w:p>
+      <w:pPr>
+        <w:spacing w:after="0"/>
+      </w:pPr>
+    </w:p>
+    <w:tbl>
+      <w:tblPr>
+        <w:tblW w:type="dxa" w:w="9360"/>
+        <w:tblLayout w:type="fixed"/>
+        <w:tblLook w:firstColumn="1" w:firstRow="1" w:lastColumn="0" w:lastRow="0" w:noHBand="0" w:noVBand="1" w:val="04A0"/>
+        <w:tblInd w:w="120" w:type="dxa"/>
+      </w:tblPr>
+      <w:tblGrid>
+        <w:gridCol w:w="9360"/>
+      </w:tblGrid>
+      <w:tr>
+        <w:trPr>
+          <w:cantSplit/>
+        </w:trPr>
+        <w:tc>
+          <w:tcPr>
+            <w:tcW w:type="dxa" w:w="9360"/>
+            <w:tcMar>
+              <w:top w:w="80" w:type="dxa"/>
+              <w:start w:w="120" w:type="dxa"/>
+              <w:bottom w:w="80" w:type="dxa"/>
+              <w:end w:w="120" w:type="dxa"/>
+            </w:tcMar>
+            <w:shd w:fill="EFF6FF"/>
+          </w:tcPr>
+          <w:p>
+            <w:r>
+              <w:rPr>
+                <w:b/>
+                <w:color w:val="2454D7"/>
+              </w:rPr>
+              <w:t xml:space="preserve">Serviços tomados: </w:t>
+            </w:r>
+            <w:r>
+              <w:t>O valor bruto da nota é apresentado como despesa e cada retenção não zerada como linha própria que reduz o líquido do fornecedor. O CCI preserva NF, série, CNPJ do fornecedor, datas de pagamento, bases, valores e códigos de retenção; código fiscal não é convertido em histórico contábil.</w:t>
             </w:r>
           </w:p>
         </w:tc>
@@ -1682,6 +1778,7 @@
           </w:tcPr>
           <w:p>
             <w:pPr>
+              <w:ind w:left="0" w:firstLine="0"/>
               <w:jc w:val="left"/>
             </w:pPr>
             <w:r>
@@ -1702,6 +1799,7 @@
           </w:tcPr>
           <w:p>
             <w:pPr>
+              <w:ind w:left="0" w:firstLine="0"/>
               <w:jc w:val="left"/>
             </w:pPr>
             <w:r>
@@ -1727,6 +1825,7 @@
           </w:tcPr>
           <w:p>
             <w:pPr>
+              <w:ind w:left="0" w:firstLine="0"/>
               <w:jc w:val="left"/>
             </w:pPr>
             <w:r>
@@ -1747,6 +1846,7 @@
           </w:tcPr>
           <w:p>
             <w:pPr>
+              <w:ind w:left="0" w:firstLine="0"/>
               <w:jc w:val="left"/>
             </w:pPr>
             <w:r>
@@ -1772,6 +1872,7 @@
           </w:tcPr>
           <w:p>
             <w:pPr>
+              <w:ind w:left="0" w:firstLine="0"/>
               <w:jc w:val="left"/>
             </w:pPr>
             <w:r>
@@ -1792,6 +1893,7 @@
           </w:tcPr>
           <w:p>
             <w:pPr>
+              <w:ind w:left="0" w:firstLine="0"/>
               <w:jc w:val="left"/>
             </w:pPr>
             <w:r>
@@ -1817,6 +1919,7 @@
           </w:tcPr>
           <w:p>
             <w:pPr>
+              <w:ind w:left="0" w:firstLine="0"/>
               <w:jc w:val="left"/>
             </w:pPr>
             <w:r>
@@ -1837,6 +1940,7 @@
           </w:tcPr>
           <w:p>
             <w:pPr>
+              <w:ind w:left="0" w:firstLine="0"/>
               <w:jc w:val="left"/>
             </w:pPr>
             <w:r>
@@ -1862,6 +1966,7 @@
           </w:tcPr>
           <w:p>
             <w:pPr>
+              <w:ind w:left="0" w:firstLine="0"/>
               <w:jc w:val="left"/>
             </w:pPr>
             <w:r>
@@ -1882,6 +1987,7 @@
           </w:tcPr>
           <w:p>
             <w:pPr>
+              <w:ind w:left="0" w:firstLine="0"/>
               <w:jc w:val="left"/>
             </w:pPr>
             <w:r>
@@ -1907,6 +2013,7 @@
           </w:tcPr>
           <w:p>
             <w:pPr>
+              <w:ind w:left="0" w:firstLine="0"/>
               <w:jc w:val="left"/>
             </w:pPr>
             <w:r>
@@ -1927,6 +2034,7 @@
           </w:tcPr>
           <w:p>
             <w:pPr>
+              <w:ind w:left="0" w:firstLine="0"/>
               <w:jc w:val="left"/>
             </w:pPr>
             <w:r>
@@ -1952,6 +2060,7 @@
           </w:tcPr>
           <w:p>
             <w:pPr>
+              <w:ind w:left="0" w:firstLine="0"/>
               <w:jc w:val="left"/>
             </w:pPr>
             <w:r>
@@ -1972,6 +2081,7 @@
           </w:tcPr>
           <w:p>
             <w:pPr>
+              <w:ind w:left="0" w:firstLine="0"/>
               <w:jc w:val="left"/>
             </w:pPr>
             <w:r>
@@ -2032,6 +2142,11 @@
       </w:pPr>
     </w:p>
     <w:p>
+      <w:r>
+        <w:br w:type="page"/>
+      </w:r>
+    </w:p>
+    <w:p>
       <w:pPr>
         <w:pStyle w:val="Heading1"/>
       </w:pPr>
@@ -2044,208 +2159,38 @@
         <w:t>O regime tributário vem do cadastro oficial do CFI. O CCI não deve inferir enquadramento por porte, CNAE ou movimentação. Divergências devem ser corrigidas no CFI e sincronizadas novamente.</w:t>
       </w:r>
     </w:p>
-    <w:tbl>
-      <w:tblPr>
-        <w:tblStyle w:val="TableGrid"/>
-        <w:tblW w:type="dxa" w:w="9360"/>
-        <w:tblLayout w:type="fixed"/>
-        <w:tblLook w:firstColumn="1" w:firstRow="1" w:lastColumn="0" w:lastRow="0" w:noHBand="0" w:noVBand="1" w:val="04A0"/>
-        <w:tblInd w:w="120" w:type="dxa"/>
-      </w:tblPr>
-      <w:tblGrid>
-        <w:gridCol w:w="4680"/>
-        <w:gridCol w:w="4680"/>
-      </w:tblGrid>
-      <w:tr>
-        <w:trPr>
-          <w:cantSplit/>
-          <w:tblHeader/>
-        </w:trPr>
-        <w:tc>
-          <w:tcPr>
-            <w:tcW w:type="dxa" w:w="4680"/>
-            <w:tcMar>
-              <w:top w:w="80" w:type="dxa"/>
-              <w:start w:w="120" w:type="dxa"/>
-              <w:bottom w:w="80" w:type="dxa"/>
-              <w:end w:w="120" w:type="dxa"/>
-            </w:tcMar>
-            <w:vAlign w:val="center"/>
-            <w:shd w:fill="E8EEF5"/>
-          </w:tcPr>
-          <w:p>
-            <w:r>
-              <w:rPr>
-                <w:b/>
-                <w:color w:val="0B2545"/>
-              </w:rPr>
-              <w:t>Regime</w:t>
-            </w:r>
-          </w:p>
-        </w:tc>
-        <w:tc>
-          <w:tcPr>
-            <w:tcW w:type="dxa" w:w="4680"/>
-            <w:tcMar>
-              <w:top w:w="80" w:type="dxa"/>
-              <w:start w:w="120" w:type="dxa"/>
-              <w:bottom w:w="80" w:type="dxa"/>
-              <w:end w:w="120" w:type="dxa"/>
-            </w:tcMar>
-            <w:vAlign w:val="center"/>
-            <w:shd w:fill="E8EEF5"/>
-          </w:tcPr>
-          <w:p>
-            <w:r>
-              <w:rPr>
-                <w:b/>
-                <w:color w:val="0B2545"/>
-              </w:rPr>
-              <w:t>Confirmações obrigatórias</w:t>
-            </w:r>
-          </w:p>
-        </w:tc>
-      </w:tr>
-      <w:tr>
-        <w:trPr>
-          <w:cantSplit/>
-        </w:trPr>
-        <w:tc>
-          <w:tcPr>
-            <w:tcW w:type="dxa" w:w="4680"/>
-            <w:vAlign w:val="center"/>
-            <w:tcMar>
-              <w:top w:w="80" w:type="dxa"/>
-              <w:start w:w="120" w:type="dxa"/>
-              <w:bottom w:w="80" w:type="dxa"/>
-              <w:end w:w="120" w:type="dxa"/>
-            </w:tcMar>
-          </w:tcPr>
-          <w:p>
-            <w:pPr>
-              <w:jc w:val="left"/>
-            </w:pPr>
-            <w:r>
-              <w:t>Simples Nacional</w:t>
-            </w:r>
-          </w:p>
-        </w:tc>
-        <w:tc>
-          <w:tcPr>
-            <w:tcW w:type="dxa" w:w="4680"/>
-            <w:vAlign w:val="center"/>
-            <w:tcMar>
-              <w:top w:w="80" w:type="dxa"/>
-              <w:start w:w="120" w:type="dxa"/>
-              <w:bottom w:w="80" w:type="dxa"/>
-              <w:end w:w="120" w:type="dxa"/>
-            </w:tcMar>
-          </w:tcPr>
-          <w:p>
-            <w:pPr>
-              <w:jc w:val="left"/>
-            </w:pPr>
-            <w:r>
-              <w:t>Critério de receita, anexos aplicáveis e revisão das segregações.</w:t>
-            </w:r>
-          </w:p>
-        </w:tc>
-      </w:tr>
-      <w:tr>
-        <w:trPr>
-          <w:cantSplit/>
-        </w:trPr>
-        <w:tc>
-          <w:tcPr>
-            <w:tcW w:type="dxa" w:w="4680"/>
-            <w:vAlign w:val="center"/>
-            <w:tcMar>
-              <w:top w:w="80" w:type="dxa"/>
-              <w:start w:w="120" w:type="dxa"/>
-              <w:bottom w:w="80" w:type="dxa"/>
-              <w:end w:w="120" w:type="dxa"/>
-            </w:tcMar>
-          </w:tcPr>
-          <w:p>
-            <w:pPr>
-              <w:jc w:val="left"/>
-            </w:pPr>
-            <w:r>
-              <w:t>Lucro Presumido</w:t>
-            </w:r>
-          </w:p>
-        </w:tc>
-        <w:tc>
-          <w:tcPr>
-            <w:tcW w:type="dxa" w:w="4680"/>
-            <w:vAlign w:val="center"/>
-            <w:tcMar>
-              <w:top w:w="80" w:type="dxa"/>
-              <w:start w:w="120" w:type="dxa"/>
-              <w:bottom w:w="80" w:type="dxa"/>
-              <w:end w:w="120" w:type="dxa"/>
-            </w:tcMar>
-          </w:tcPr>
-          <w:p>
-            <w:pPr>
-              <w:jc w:val="left"/>
-            </w:pPr>
-            <w:r>
-              <w:t>Periodicidade de IRPJ/CSLL, tratamento de PIS/COFINS e revisão de atividades e receitas adicionais.</w:t>
-            </w:r>
-          </w:p>
-        </w:tc>
-      </w:tr>
-      <w:tr>
-        <w:trPr>
-          <w:cantSplit/>
-        </w:trPr>
-        <w:tc>
-          <w:tcPr>
-            <w:tcW w:type="dxa" w:w="4680"/>
-            <w:vAlign w:val="center"/>
-            <w:tcMar>
-              <w:top w:w="80" w:type="dxa"/>
-              <w:start w:w="120" w:type="dxa"/>
-              <w:bottom w:w="80" w:type="dxa"/>
-              <w:end w:w="120" w:type="dxa"/>
-            </w:tcMar>
-          </w:tcPr>
-          <w:p>
-            <w:pPr>
-              <w:jc w:val="left"/>
-            </w:pPr>
-            <w:r>
-              <w:t>Lucro Real</w:t>
-            </w:r>
-          </w:p>
-        </w:tc>
-        <w:tc>
-          <w:tcPr>
-            <w:tcW w:type="dxa" w:w="4680"/>
-            <w:vAlign w:val="center"/>
-            <w:tcMar>
-              <w:top w:w="80" w:type="dxa"/>
-              <w:start w:w="120" w:type="dxa"/>
-              <w:bottom w:w="80" w:type="dxa"/>
-              <w:end w:w="120" w:type="dxa"/>
-            </w:tcMar>
-          </w:tcPr>
-          <w:p>
-            <w:pPr>
-              <w:jc w:val="left"/>
-            </w:pPr>
-            <w:r>
-              <w:t>Forma de apuração, tratamento de PIS/COFINS, e-Lalur/e-Lacs e critérios de créditos.</w:t>
-            </w:r>
-          </w:p>
-        </w:tc>
-      </w:tr>
-    </w:tbl>
     <w:p>
-      <w:pPr>
-        <w:spacing w:after="0"/>
-      </w:pPr>
+      <w:r>
+        <w:rPr>
+          <w:b/>
+        </w:rPr>
+        <w:t xml:space="preserve">Simples Nacional: </w:t>
+      </w:r>
+      <w:r>
+        <w:t>Confirmar critério de receita, anexos aplicáveis e revisão das segregações.</w:t>
+      </w:r>
+    </w:p>
+    <w:p>
+      <w:r>
+        <w:rPr>
+          <w:b/>
+        </w:rPr>
+        <w:t xml:space="preserve">Lucro Presumido: </w:t>
+      </w:r>
+      <w:r>
+        <w:t>Confirmar periodicidade de IRPJ/CSLL, tratamento de PIS/COFINS e revisão de atividades e receitas adicionais.</w:t>
+      </w:r>
+    </w:p>
+    <w:p>
+      <w:r>
+        <w:rPr>
+          <w:b/>
+        </w:rPr>
+        <w:t xml:space="preserve">Lucro Real: </w:t>
+      </w:r>
+      <w:r>
+        <w:t>Confirmar forma de apuração, tratamento de PIS/COFINS, e-Lalur/e-Lacs e critérios de créditos.</w:t>
+      </w:r>
     </w:p>
     <w:tbl>
       <w:tblPr>
@@ -2526,6 +2471,7 @@
           </w:tcPr>
           <w:p>
             <w:pPr>
+              <w:ind w:left="0" w:firstLine="0"/>
               <w:jc w:val="left"/>
             </w:pPr>
             <w:r>
@@ -2546,6 +2492,7 @@
           </w:tcPr>
           <w:p>
             <w:pPr>
+              <w:ind w:left="0" w:firstLine="0"/>
               <w:jc w:val="left"/>
             </w:pPr>
             <w:r>
@@ -2566,6 +2513,7 @@
           </w:tcPr>
           <w:p>
             <w:pPr>
+              <w:ind w:left="0" w:firstLine="0"/>
               <w:jc w:val="left"/>
             </w:pPr>
             <w:r>
@@ -2591,6 +2539,7 @@
           </w:tcPr>
           <w:p>
             <w:pPr>
+              <w:ind w:left="0" w:firstLine="0"/>
               <w:jc w:val="left"/>
             </w:pPr>
             <w:r>
@@ -2611,6 +2560,7 @@
           </w:tcPr>
           <w:p>
             <w:pPr>
+              <w:ind w:left="0" w:firstLine="0"/>
               <w:jc w:val="left"/>
             </w:pPr>
             <w:r>
@@ -2631,6 +2581,7 @@
           </w:tcPr>
           <w:p>
             <w:pPr>
+              <w:ind w:left="0" w:firstLine="0"/>
               <w:jc w:val="left"/>
             </w:pPr>
             <w:r>
@@ -2656,6 +2607,7 @@
           </w:tcPr>
           <w:p>
             <w:pPr>
+              <w:ind w:left="0" w:firstLine="0"/>
               <w:jc w:val="left"/>
             </w:pPr>
             <w:r>
@@ -2676,6 +2628,7 @@
           </w:tcPr>
           <w:p>
             <w:pPr>
+              <w:ind w:left="0" w:firstLine="0"/>
               <w:jc w:val="left"/>
             </w:pPr>
             <w:r>
@@ -2696,6 +2649,7 @@
           </w:tcPr>
           <w:p>
             <w:pPr>
+              <w:ind w:left="0" w:firstLine="0"/>
               <w:jc w:val="left"/>
             </w:pPr>
             <w:r>
@@ -2721,6 +2675,7 @@
           </w:tcPr>
           <w:p>
             <w:pPr>
+              <w:ind w:left="0" w:firstLine="0"/>
               <w:jc w:val="left"/>
             </w:pPr>
             <w:r>
@@ -2741,6 +2696,7 @@
           </w:tcPr>
           <w:p>
             <w:pPr>
+              <w:ind w:left="0" w:firstLine="0"/>
               <w:jc w:val="left"/>
             </w:pPr>
             <w:r>
@@ -2761,6 +2717,7 @@
           </w:tcPr>
           <w:p>
             <w:pPr>
+              <w:ind w:left="0" w:firstLine="0"/>
               <w:jc w:val="left"/>
             </w:pPr>
             <w:r>
@@ -2786,6 +2743,7 @@
           </w:tcPr>
           <w:p>
             <w:pPr>
+              <w:ind w:left="0" w:firstLine="0"/>
               <w:jc w:val="left"/>
             </w:pPr>
             <w:r>
@@ -2806,6 +2764,7 @@
           </w:tcPr>
           <w:p>
             <w:pPr>
+              <w:ind w:left="0" w:firstLine="0"/>
               <w:jc w:val="left"/>
             </w:pPr>
             <w:r>
@@ -2826,6 +2785,7 @@
           </w:tcPr>
           <w:p>
             <w:pPr>
+              <w:ind w:left="0" w:firstLine="0"/>
               <w:jc w:val="left"/>
             </w:pPr>
             <w:r>
@@ -2851,6 +2811,7 @@
           </w:tcPr>
           <w:p>
             <w:pPr>
+              <w:ind w:left="0" w:firstLine="0"/>
               <w:jc w:val="left"/>
             </w:pPr>
             <w:r>
@@ -2871,6 +2832,7 @@
           </w:tcPr>
           <w:p>
             <w:pPr>
+              <w:ind w:left="0" w:firstLine="0"/>
               <w:jc w:val="left"/>
             </w:pPr>
             <w:r>
@@ -2891,6 +2853,7 @@
           </w:tcPr>
           <w:p>
             <w:pPr>
+              <w:ind w:left="0" w:firstLine="0"/>
               <w:jc w:val="left"/>
             </w:pPr>
             <w:r>
@@ -2951,6 +2914,11 @@
       </w:pPr>
     </w:p>
     <w:p>
+      <w:r>
+        <w:br w:type="page"/>
+      </w:r>
+    </w:p>
+    <w:p>
       <w:pPr>
         <w:pStyle w:val="Heading1"/>
       </w:pPr>
@@ -2958,298 +2926,60 @@
         <w:t>12. Próxima frente: divisão do trabalho</w:t>
       </w:r>
     </w:p>
-    <w:tbl>
-      <w:tblPr>
-        <w:tblStyle w:val="TableGrid"/>
-        <w:tblW w:type="dxa" w:w="9360"/>
-        <w:tblLayout w:type="fixed"/>
-        <w:tblLook w:firstColumn="1" w:firstRow="1" w:lastColumn="0" w:lastRow="0" w:noHBand="0" w:noVBand="1" w:val="04A0"/>
-        <w:tblInd w:w="120" w:type="dxa"/>
-      </w:tblPr>
-      <w:tblGrid>
-        <w:gridCol w:w="4680"/>
-        <w:gridCol w:w="4680"/>
-      </w:tblGrid>
-      <w:tr>
-        <w:trPr>
-          <w:cantSplit/>
-          <w:tblHeader/>
-        </w:trPr>
-        <w:tc>
-          <w:tcPr>
-            <w:tcW w:type="dxa" w:w="4680"/>
-            <w:tcMar>
-              <w:top w:w="80" w:type="dxa"/>
-              <w:start w:w="120" w:type="dxa"/>
-              <w:bottom w:w="80" w:type="dxa"/>
-              <w:end w:w="120" w:type="dxa"/>
-            </w:tcMar>
-            <w:vAlign w:val="center"/>
-            <w:shd w:fill="E8EEF5"/>
-          </w:tcPr>
-          <w:p>
-            <w:r>
-              <w:rPr>
-                <w:b/>
-                <w:color w:val="0B2545"/>
-              </w:rPr>
-              <w:t>Frente do Paulo e equipe</w:t>
-            </w:r>
-          </w:p>
-        </w:tc>
-        <w:tc>
-          <w:tcPr>
-            <w:tcW w:type="dxa" w:w="4680"/>
-            <w:tcMar>
-              <w:top w:w="80" w:type="dxa"/>
-              <w:start w:w="120" w:type="dxa"/>
-              <w:bottom w:w="80" w:type="dxa"/>
-              <w:end w:w="120" w:type="dxa"/>
-            </w:tcMar>
-            <w:vAlign w:val="center"/>
-            <w:shd w:fill="E8EEF5"/>
-          </w:tcPr>
-          <w:p>
-            <w:r>
-              <w:rPr>
-                <w:b/>
-                <w:color w:val="0B2545"/>
-              </w:rPr>
-              <w:t>Frente de desenvolvimento</w:t>
-            </w:r>
-          </w:p>
-        </w:tc>
-      </w:tr>
-      <w:tr>
-        <w:trPr>
-          <w:cantSplit/>
-        </w:trPr>
-        <w:tc>
-          <w:tcPr>
-            <w:tcW w:type="dxa" w:w="4680"/>
-            <w:vAlign w:val="center"/>
-            <w:tcMar>
-              <w:top w:w="80" w:type="dxa"/>
-              <w:start w:w="120" w:type="dxa"/>
-              <w:bottom w:w="80" w:type="dxa"/>
-              <w:end w:w="120" w:type="dxa"/>
-            </w:tcMar>
-          </w:tcPr>
-          <w:p>
-            <w:pPr>
-              <w:jc w:val="left"/>
-            </w:pPr>
-            <w:r>
-              <w:t>Escolher 2 ou 3 empresas-piloto e a competência inicial.</w:t>
-            </w:r>
-          </w:p>
-        </w:tc>
-        <w:tc>
-          <w:tcPr>
-            <w:tcW w:type="dxa" w:w="4680"/>
-            <w:vAlign w:val="center"/>
-            <w:tcMar>
-              <w:top w:w="80" w:type="dxa"/>
-              <w:start w:w="120" w:type="dxa"/>
-              <w:bottom w:w="80" w:type="dxa"/>
-              <w:end w:w="120" w:type="dxa"/>
-            </w:tcMar>
-          </w:tcPr>
-          <w:p>
-            <w:pPr>
-              <w:jc w:val="left"/>
-            </w:pPr>
-            <w:r>
-              <w:t>Preparar roteiro reproduzível e painel de pendências do piloto.</w:t>
-            </w:r>
-          </w:p>
-        </w:tc>
-      </w:tr>
-      <w:tr>
-        <w:trPr>
-          <w:cantSplit/>
-        </w:trPr>
-        <w:tc>
-          <w:tcPr>
-            <w:tcW w:type="dxa" w:w="4680"/>
-            <w:vAlign w:val="center"/>
-            <w:tcMar>
-              <w:top w:w="80" w:type="dxa"/>
-              <w:start w:w="120" w:type="dxa"/>
-              <w:bottom w:w="80" w:type="dxa"/>
-              <w:end w:w="120" w:type="dxa"/>
-            </w:tcMar>
-          </w:tcPr>
-          <w:p>
-            <w:pPr>
-              <w:jc w:val="left"/>
-            </w:pPr>
-            <w:r>
-              <w:t>Cadastrar/aprovar saldos anteriores, regime, plano e históricos.</w:t>
-            </w:r>
-          </w:p>
-        </w:tc>
-        <w:tc>
-          <w:tcPr>
-            <w:tcW w:type="dxa" w:w="4680"/>
-            <w:vAlign w:val="center"/>
-            <w:tcMar>
-              <w:top w:w="80" w:type="dxa"/>
-              <w:start w:w="120" w:type="dxa"/>
-              <w:bottom w:w="80" w:type="dxa"/>
-              <w:end w:w="120" w:type="dxa"/>
-            </w:tcMar>
-          </w:tcPr>
-          <w:p>
-            <w:pPr>
-              <w:jc w:val="left"/>
-            </w:pPr>
-            <w:r>
-              <w:t>Validar travas, rastreabilidade e consistência desses cadastros.</w:t>
-            </w:r>
-          </w:p>
-        </w:tc>
-      </w:tr>
-      <w:tr>
-        <w:trPr>
-          <w:cantSplit/>
-        </w:trPr>
-        <w:tc>
-          <w:tcPr>
-            <w:tcW w:type="dxa" w:w="4680"/>
-            <w:vAlign w:val="center"/>
-            <w:tcMar>
-              <w:top w:w="80" w:type="dxa"/>
-              <w:start w:w="120" w:type="dxa"/>
-              <w:bottom w:w="80" w:type="dxa"/>
-              <w:end w:w="120" w:type="dxa"/>
-            </w:tcMar>
-          </w:tcPr>
-          <w:p>
-            <w:pPr>
-              <w:jc w:val="left"/>
-            </w:pPr>
-            <w:r>
-              <w:t>Fornecer extratos, livros e relatórios finais da SAGE para comparação.</w:t>
-            </w:r>
-          </w:p>
-        </w:tc>
-        <w:tc>
-          <w:tcPr>
-            <w:tcW w:type="dxa" w:w="4680"/>
-            <w:vAlign w:val="center"/>
-            <w:tcMar>
-              <w:top w:w="80" w:type="dxa"/>
-              <w:start w:w="120" w:type="dxa"/>
-              <w:bottom w:w="80" w:type="dxa"/>
-              <w:end w:w="120" w:type="dxa"/>
-            </w:tcMar>
-          </w:tcPr>
-          <w:p>
-            <w:pPr>
-              <w:jc w:val="left"/>
-            </w:pPr>
-            <w:r>
-              <w:t>Implementar conciliação formal e testes com os arquivos aprovados.</w:t>
-            </w:r>
-          </w:p>
-        </w:tc>
-      </w:tr>
-      <w:tr>
-        <w:trPr>
-          <w:cantSplit/>
-        </w:trPr>
-        <w:tc>
-          <w:tcPr>
-            <w:tcW w:type="dxa" w:w="4680"/>
-            <w:vAlign w:val="center"/>
-            <w:tcMar>
-              <w:top w:w="80" w:type="dxa"/>
-              <w:start w:w="120" w:type="dxa"/>
-              <w:bottom w:w="80" w:type="dxa"/>
-              <w:end w:w="120" w:type="dxa"/>
-            </w:tcMar>
-          </w:tcPr>
-          <w:p>
-            <w:pPr>
-              <w:jc w:val="left"/>
-            </w:pPr>
-            <w:r>
-              <w:t>Definir contas críticas e política do ativo/depreciação.</w:t>
-            </w:r>
-          </w:p>
-        </w:tc>
-        <w:tc>
-          <w:tcPr>
-            <w:tcW w:type="dxa" w:w="4680"/>
-            <w:vAlign w:val="center"/>
-            <w:tcMar>
-              <w:top w:w="80" w:type="dxa"/>
-              <w:start w:w="120" w:type="dxa"/>
-              <w:bottom w:w="80" w:type="dxa"/>
-              <w:end w:w="120" w:type="dxa"/>
-            </w:tcMar>
-          </w:tcPr>
-          <w:p>
-            <w:pPr>
-              <w:jc w:val="left"/>
-            </w:pPr>
-            <w:r>
-              <w:t>Integrar o ativo à prévia de lançamentos, sem decisão contábil automática.</w:t>
-            </w:r>
-          </w:p>
-        </w:tc>
-      </w:tr>
-      <w:tr>
-        <w:trPr>
-          <w:cantSplit/>
-        </w:trPr>
-        <w:tc>
-          <w:tcPr>
-            <w:tcW w:type="dxa" w:w="4680"/>
-            <w:vAlign w:val="center"/>
-            <w:tcMar>
-              <w:top w:w="80" w:type="dxa"/>
-              <w:start w:w="120" w:type="dxa"/>
-              <w:bottom w:w="80" w:type="dxa"/>
-              <w:end w:w="120" w:type="dxa"/>
-            </w:tcMar>
-          </w:tcPr>
-          <w:p>
-            <w:pPr>
-              <w:jc w:val="left"/>
-            </w:pPr>
-            <w:r>
-              <w:t>Aprovar relatórios e registrar exceções de cada fechamento.</w:t>
-            </w:r>
-          </w:p>
-        </w:tc>
-        <w:tc>
-          <w:tcPr>
-            <w:tcW w:type="dxa" w:w="4680"/>
-            <w:vAlign w:val="center"/>
-            <w:tcMar>
-              <w:top w:w="80" w:type="dxa"/>
-              <w:start w:w="120" w:type="dxa"/>
-              <w:bottom w:w="80" w:type="dxa"/>
-              <w:end w:w="120" w:type="dxa"/>
-            </w:tcMar>
-          </w:tcPr>
-          <w:p>
-            <w:pPr>
-              <w:jc w:val="left"/>
-            </w:pPr>
-            <w:r>
-              <w:t>Corrigir, testar, versionar, publicar e verificar cada etapa em produção.</w:t>
-            </w:r>
-          </w:p>
-        </w:tc>
-      </w:tr>
-    </w:tbl>
     <w:p>
-      <w:pPr>
-        <w:spacing w:after="0"/>
-      </w:pPr>
+      <w:r>
+        <w:rPr>
+          <w:b/>
+        </w:rPr>
+        <w:t xml:space="preserve">1. Pilotos: </w:t>
+      </w:r>
+      <w:r>
+        <w:t>Paulo e equipe escolhem 2 ou 3 empresas e a competência inicial; desenvolvimento prepara o roteiro reproduzível e o painel de pendências.</w:t>
+      </w:r>
+    </w:p>
+    <w:p>
+      <w:r>
+        <w:rPr>
+          <w:b/>
+        </w:rPr>
+        <w:t xml:space="preserve">2. Cadastros: </w:t>
+      </w:r>
+      <w:r>
+        <w:t>Paulo e equipe aprovam saldos anteriores, regime, plano e históricos; desenvolvimento valida travas, rastreabilidade e consistência.</w:t>
+      </w:r>
+    </w:p>
+    <w:p>
+      <w:r>
+        <w:rPr>
+          <w:b/>
+        </w:rPr>
+        <w:t xml:space="preserve">3. Comparação: </w:t>
+      </w:r>
+      <w:r>
+        <w:t>Paulo e equipe fornecem extratos, livros e relatórios finais da SAGE; desenvolvimento implementa a conciliação formal e os testes.</w:t>
+      </w:r>
+    </w:p>
+    <w:p>
+      <w:r>
+        <w:rPr>
+          <w:b/>
+        </w:rPr>
+        <w:t xml:space="preserve">4. Ativo: </w:t>
+      </w:r>
+      <w:r>
+        <w:t>Paulo e equipe definem contas críticas e a política patrimonial; desenvolvimento integra o ativo à prévia, sem decisão contábil automática.</w:t>
+      </w:r>
+    </w:p>
+    <w:p>
+      <w:r>
+        <w:rPr>
+          <w:b/>
+        </w:rPr>
+        <w:t xml:space="preserve">5. Fechamento: </w:t>
+      </w:r>
+      <w:r>
+        <w:t>Paulo e equipe aprovam relatórios e registram exceções; desenvolvimento corrige, testa, versiona, publica e verifica cada etapa.</w:t>
+      </w:r>
     </w:p>
     <w:tbl>
       <w:tblPr>
@@ -3319,7 +3049,7 @@
       <w:rPr>
         <w:sz w:val="16"/>
       </w:rPr>
-      <w:t>Uso interno  •  v2.5  •  18/08/2026</w:t>
+      <w:t>Uso interno  •  v2.6  •  18/08/2026</w:t>
     </w:r>
   </w:p>
 </w:ftr>

</xml_diff>

<commit_message>
feat: adicionar cadastro matriz e filial
</commit_message>
<xml_diff>
--- a/downloads/Manual_Operacional_CCI.docx
+++ b/downloads/Manual_Operacional_CCI.docx
@@ -55,7 +55,7 @@
           <w:color w:val="64748B"/>
           <w:sz w:val="20"/>
         </w:rPr>
-        <w:t>Versão 2.6  |  18 de agosto de 2026  |  Uso interno</w:t>
+        <w:t>Versão 2.7  |  18 de agosto de 2026  |  Uso interno</w:t>
       </w:r>
     </w:p>
     <w:p/>
@@ -947,6 +947,18 @@
     </w:p>
     <w:p>
       <w:pPr>
+        <w:spacing w:after="80" w:line="300" w:lineRule="auto"/>
+        <w:numPr>
+          <w:ilvl w:val="0"/>
+          <w:numId w:val="10"/>
+        </w:numPr>
+      </w:pPr>
+      <w:r>
+        <w:t>Nova área Dados e Matriz/Filial, com cadastro completo da empresa, vínculo direto da filial à matriz principal e relação das unidades vinculadas.</w:t>
+      </w:r>
+    </w:p>
+    <w:p>
+      <w:pPr>
         <w:pStyle w:val="Heading1"/>
       </w:pPr>
       <w:r>
@@ -995,6 +1007,28 @@
       </w:r>
       <w:r>
         <w:t>Fotografia validada da competência. Depois de fechado, o período fica protegido e só deve ser reaberto por usuário autorizado, com justificativa.</w:t>
+      </w:r>
+    </w:p>
+    <w:p>
+      <w:r>
+        <w:rPr>
+          <w:b/>
+        </w:rPr>
+        <w:t xml:space="preserve">Cadastro oficial da empresa: </w:t>
+      </w:r>
+      <w:r>
+        <w:t>Registro único do CCI para razão social, nome fantasia, endereço, inscrições, CNAE, datas, contatos e estrutura empresarial. Alterações ficam vinculadas ao usuário e à data da atualização.</w:t>
+      </w:r>
+    </w:p>
+    <w:p>
+      <w:r>
+        <w:rPr>
+          <w:b/>
+        </w:rPr>
+        <w:t xml:space="preserve">Matriz e filial: </w:t>
+      </w:r>
+      <w:r>
+        <w:t>Uma filial deve apontar diretamente para a matriz principal já cadastrada no CCI. O sistema bloqueia auto vínculo, ciclos, uso de outra filial como matriz e conversão de matriz que ainda possua filiais vinculadas.</w:t>
       </w:r>
     </w:p>
     <w:p>
@@ -3049,7 +3083,7 @@
       <w:rPr>
         <w:sz w:val="16"/>
       </w:rPr>
-      <w:t>Uso interno  •  v2.6  •  18/08/2026</w:t>
+      <w:t>Uso interno  •  v2.7  •  18/08/2026</w:t>
     </w:r>
   </w:p>
 </w:ftr>

</xml_diff>

<commit_message>
feat: completar ciclo contabil e regimes especiais
</commit_message>
<xml_diff>
--- a/downloads/Manual_Operacional_CCI.docx
+++ b/downloads/Manual_Operacional_CCI.docx
@@ -55,7 +55,7 @@
           <w:color w:val="64748B"/>
           <w:sz w:val="20"/>
         </w:rPr>
-        <w:t>Versão 2.7  |  18 de agosto de 2026  |  Uso interno</w:t>
+        <w:t>Versão 2.8  |  18 de agosto de 2026  |  Uso interno</w:t>
       </w:r>
     </w:p>
     <w:p/>
@@ -93,7 +93,7 @@
               <w:t xml:space="preserve">Situação atual: </w:t>
             </w:r>
             <w:r>
-              <w:t>A operação cotidiana já cobre importações, classificação, relatórios, fechamento e ECD/ECF. A retirada definitiva da SAGE depende dos fechamentos-piloto, conciliação formal, automação patrimonial e validações operacionais finais.</w:t>
+              <w:t>A operação cotidiana já cobre importações, classificação, relatórios, fechamento, conciliação bancária formal, transporte controlado de saldos, eventos contábeis do ativo imobilizado e ECD/ECF. A retirada definitiva da SAGE depende da homologação dessas rotinas em fechamentos-piloto e das validações operacionais finais.</w:t>
             </w:r>
           </w:p>
         </w:tc>
@@ -648,7 +648,7 @@
               <w:jc w:val="left"/>
             </w:pPr>
             <w:r>
-              <w:t>Em evolução</w:t>
+              <w:t>Implementado, em homologação</w:t>
             </w:r>
           </w:p>
         </w:tc>
@@ -669,7 +669,7 @@
               <w:jc w:val="left"/>
             </w:pPr>
             <w:r>
-              <w:t>Cadastro e cálculo existem; lançamentos automáticos ainda dependem de implementação e aprovação.</w:t>
+              <w:t>Aquisição, transferência, depreciação e baixa geram prévia e somente incluem lançamentos após aprovação.</w:t>
             </w:r>
           </w:p>
         </w:tc>
@@ -695,7 +695,75 @@
               <w:jc w:val="left"/>
             </w:pPr>
             <w:r>
-              <w:t>Conciliação formal e escala</w:t>
+              <w:t>Conciliação e transporte</w:t>
+            </w:r>
+          </w:p>
+        </w:tc>
+        <w:tc>
+          <w:tcPr>
+            <w:tcW w:type="dxa" w:w="2460"/>
+            <w:vAlign w:val="center"/>
+            <w:tcMar>
+              <w:top w:w="80" w:type="dxa"/>
+              <w:start w:w="120" w:type="dxa"/>
+              <w:bottom w:w="80" w:type="dxa"/>
+              <w:end w:w="120" w:type="dxa"/>
+            </w:tcMar>
+          </w:tcPr>
+          <w:p>
+            <w:pPr>
+              <w:ind w:left="0" w:firstLine="0"/>
+              <w:jc w:val="left"/>
+            </w:pPr>
+            <w:r>
+              <w:t>Implementado, em homologação</w:t>
+            </w:r>
+          </w:p>
+        </w:tc>
+        <w:tc>
+          <w:tcPr>
+            <w:tcW w:type="dxa" w:w="4800"/>
+            <w:vAlign w:val="center"/>
+            <w:tcMar>
+              <w:top w:w="80" w:type="dxa"/>
+              <w:start w:w="120" w:type="dxa"/>
+              <w:bottom w:w="80" w:type="dxa"/>
+              <w:end w:w="120" w:type="dxa"/>
+            </w:tcMar>
+          </w:tcPr>
+          <w:p>
+            <w:pPr>
+              <w:ind w:left="0" w:firstLine="0"/>
+              <w:jc w:val="left"/>
+            </w:pPr>
+            <w:r>
+              <w:t>Confronta saldo contábil e extrato; o fechamento transporta e protege os saldos da competência seguinte.</w:t>
+            </w:r>
+          </w:p>
+        </w:tc>
+      </w:tr>
+      <w:tr>
+        <w:trPr>
+          <w:cantSplit/>
+        </w:trPr>
+        <w:tc>
+          <w:tcPr>
+            <w:tcW w:type="dxa" w:w="2100"/>
+            <w:vAlign w:val="center"/>
+            <w:tcMar>
+              <w:top w:w="80" w:type="dxa"/>
+              <w:start w:w="120" w:type="dxa"/>
+              <w:bottom w:w="80" w:type="dxa"/>
+              <w:end w:w="120" w:type="dxa"/>
+            </w:tcMar>
+          </w:tcPr>
+          <w:p>
+            <w:pPr>
+              <w:ind w:left="0" w:firstLine="0"/>
+              <w:jc w:val="left"/>
+            </w:pPr>
+            <w:r>
+              <w:t>Escala e recuperação</w:t>
             </w:r>
           </w:p>
         </w:tc>
@@ -737,7 +805,7 @@
               <w:jc w:val="left"/>
             </w:pPr>
             <w:r>
-              <w:t>Ainda requer homologação por saldo bancário, concorrência, recuperação e volume.</w:t>
+              <w:t>Ainda requer homologação de backup/restauração, concorrência e volume.</w:t>
             </w:r>
           </w:p>
         </w:tc>
@@ -858,7 +926,55 @@
         </w:numPr>
       </w:pPr>
       <w:r>
-        <w:t>Parametrizações específicas para Simples Nacional, Lucro Presumido e Lucro Real, confirmadas por administrador.</w:t>
+        <w:t>Parametrizações para Simples Nacional, Lucro Presumido, Lucro Real, Isenta, Imune e Terceiro Setor, confirmadas por administrador.</w:t>
+      </w:r>
+    </w:p>
+    <w:p>
+      <w:pPr>
+        <w:spacing w:after="80" w:line="300" w:lineRule="auto"/>
+        <w:numPr>
+          <w:ilvl w:val="0"/>
+          <w:numId w:val="10"/>
+        </w:numPr>
+      </w:pPr>
+      <w:r>
+        <w:t>Entidades especiais cruzam o CNAE principal recebido do CFI com parecer orientativo do Gemini 3.7, sem decisão automática de enquadramento.</w:t>
+      </w:r>
+    </w:p>
+    <w:p>
+      <w:pPr>
+        <w:spacing w:after="80" w:line="300" w:lineRule="auto"/>
+        <w:numPr>
+          <w:ilvl w:val="0"/>
+          <w:numId w:val="10"/>
+        </w:numPr>
+      </w:pPr>
+      <w:r>
+        <w:t>Conciliação bancária formal com saldo contábil, saldo do extrato, diferença, usuário, data e hash do período.</w:t>
+      </w:r>
+    </w:p>
+    <w:p>
+      <w:pPr>
+        <w:spacing w:after="80" w:line="300" w:lineRule="auto"/>
+        <w:numPr>
+          <w:ilvl w:val="0"/>
+          <w:numId w:val="10"/>
+        </w:numPr>
+      </w:pPr>
+      <w:r>
+        <w:t>Transporte automático e protegido dos saldos finais após o fechamento, incluindo a passagem de dezembro para janeiro.</w:t>
+      </w:r>
+    </w:p>
+    <w:p>
+      <w:pPr>
+        <w:spacing w:after="80" w:line="300" w:lineRule="auto"/>
+        <w:numPr>
+          <w:ilvl w:val="0"/>
+          <w:numId w:val="10"/>
+        </w:numPr>
+      </w:pPr>
+      <w:r>
+        <w:t>Aquisição, transferência, depreciação e baixa integradas à sessão contábil mediante prévia, aprovação e proteção contra duplicidade.</w:t>
       </w:r>
     </w:p>
     <w:p>
@@ -1712,7 +1828,16 @@
         <w:ind w:left="270"/>
       </w:pPr>
       <w:r>
-        <w:t>☐ Diferenças identificadas, justificadas e corrigidas antes do fechamento.</w:t>
+        <w:t>☐ Usar Conciliação bancária formal, informar conta e saldo final do extrato e aprovar somente quando a diferença for zero.</w:t>
+      </w:r>
+    </w:p>
+    <w:p>
+      <w:pPr>
+        <w:spacing w:after="80" w:line="300" w:lineRule="auto"/>
+        <w:ind w:left="270"/>
+      </w:pPr>
+      <w:r>
+        <w:t>☐ Diferenças identificadas, justificadas e corrigidas antes do fechamento; conta já cadastrada para conciliação passa a ser obrigatória nos meses seguintes.</w:t>
       </w:r>
     </w:p>
     <w:p>
@@ -2161,10 +2286,10 @@
                 <w:b/>
                 <w:color w:val="2454D7"/>
               </w:rPr>
-              <w:t xml:space="preserve">Período aberto: </w:t>
+              <w:t xml:space="preserve">Fechamento e transporte: </w:t>
             </w:r>
             <w:r>
-              <w:t>Os relatórios podem ser visualizados antes do fechamento. O fechamento preserva a versão aprovada; não é necessário esperar para revisar.</w:t>
+              <w:t>Os relatórios podem ser visualizados antes do fechamento. Ao encerrar, o CCI preserva a fotografia aprovada e gera os saldos da competência seguinte. Esses saldos ficam protegidos; para alterá-los, reabra a competência de origem e respeite a sequência mensal.</w:t>
             </w:r>
           </w:p>
         </w:tc>
@@ -2174,11 +2299,6 @@
       <w:pPr>
         <w:spacing w:after="0"/>
       </w:pPr>
-    </w:p>
-    <w:p>
-      <w:r>
-        <w:br w:type="page"/>
-      </w:r>
     </w:p>
     <w:p>
       <w:pPr>
@@ -2226,67 +2346,37 @@
         <w:t>Confirmar forma de apuração, tratamento de PIS/COFINS, e-Lalur/e-Lacs e critérios de créditos.</w:t>
       </w:r>
     </w:p>
-    <w:tbl>
-      <w:tblPr>
-        <w:tblW w:type="dxa" w:w="9360"/>
-        <w:tblLayout w:type="fixed"/>
-        <w:tblLook w:firstColumn="1" w:firstRow="1" w:lastColumn="0" w:lastRow="0" w:noHBand="0" w:noVBand="1" w:val="04A0"/>
-        <w:tblInd w:w="120" w:type="dxa"/>
-      </w:tblPr>
-      <w:tblGrid>
-        <w:gridCol w:w="9360"/>
-      </w:tblGrid>
-      <w:tr>
-        <w:trPr>
-          <w:cantSplit/>
-        </w:trPr>
-        <w:tc>
-          <w:tcPr>
-            <w:tcW w:type="dxa" w:w="9360"/>
-            <w:tcMar>
-              <w:top w:w="80" w:type="dxa"/>
-              <w:start w:w="120" w:type="dxa"/>
-              <w:bottom w:w="80" w:type="dxa"/>
-              <w:end w:w="120" w:type="dxa"/>
-            </w:tcMar>
-            <w:shd w:fill="FFF7ED"/>
-          </w:tcPr>
-          <w:p>
-            <w:r>
-              <w:rPr>
-                <w:b/>
-                <w:color w:val="9A3412"/>
-              </w:rPr>
-              <w:t xml:space="preserve">Acesso administrativo: </w:t>
-            </w:r>
-            <w:r>
-              <w:t>Somente administrador confirma a parametrização. O CCI registra pendências e bloqueia o fechamento exclusivo, mas não inventa anexos, percentuais, créditos ou exceções fiscais.</w:t>
-            </w:r>
-          </w:p>
-        </w:tc>
-      </w:tr>
-    </w:tbl>
     <w:p>
-      <w:pPr>
-        <w:spacing w:after="0"/>
-      </w:pPr>
-    </w:p>
-    <w:p>
-      <w:pPr>
-        <w:pStyle w:val="Heading1"/>
-      </w:pPr>
       <w:r>
-        <w:t>9. ECD/ECF, ativo e depreciação</w:t>
+        <w:rPr>
+          <w:b/>
+        </w:rPr>
+        <w:t xml:space="preserve">Isenta: </w:t>
+      </w:r>
+      <w:r>
+        <w:t>Confirmar CNAE, fundamento legal, vigência, documentação e segregação de receitas abrangidas e não abrangidas.</w:t>
       </w:r>
     </w:p>
     <w:p>
       <w:r>
-        <w:t>A ECD/ECF faz parte da operação atual. Conferir matriz, filiais, CNPJ, período, registros estruturais, validações internas e PVA; preservar arquivo transmitido, recibo e relatório de validação.</w:t>
+        <w:rPr>
+          <w:b/>
+        </w:rPr>
+        <w:t xml:space="preserve">Imune: </w:t>
+      </w:r>
+      <w:r>
+        <w:t>Confirmar fundamento constitucional, natureza jurídica, documentação e operações eventualmente fora da imunidade.</w:t>
       </w:r>
     </w:p>
     <w:p>
       <w:r>
-        <w:t>O módulo patrimonial cadastra bens, vida útil, valor residual e contas, acompanhando depreciação acumulada, valor contábil e baixa. Nesta etapa, cadastro e cálculo não substituem os lançamentos contábeis mensais.</w:t>
+        <w:rPr>
+          <w:b/>
+        </w:rPr>
+        <w:t xml:space="preserve">Terceiro Setor: </w:t>
+      </w:r>
+      <w:r>
+        <w:t>Confirmar a qualificação complementar como imune, isenta ou tributada; Terceiro Setor, isoladamente, não define o tratamento tributário.</w:t>
       </w:r>
     </w:p>
     <w:tbl>
@@ -2320,10 +2410,73 @@
                 <w:b/>
                 <w:color w:val="9A3412"/>
               </w:rPr>
-              <w:t xml:space="preserve">Até a automação: </w:t>
+              <w:t xml:space="preserve">IA orientativa e acesso administrativo: </w:t>
             </w:r>
             <w:r>
-              <w:t>O colaborador deve calcular, revisar e lançar a depreciação na escrituração, vinculando despesa e depreciação acumulada. O cadastro do bem, isoladamente, não atualiza os relatórios.</w:t>
+              <w:t>Somente administrador confirma a parametrização. Para Isenta, Imune e Terceiro Setor, o Gemini 3.7 cruza o CNAE do CFI com o enquadramento informado e aponta documentos a conferir. O parecer não altera o regime nem substitui a decisão do responsável contábil.</w:t>
+            </w:r>
+          </w:p>
+        </w:tc>
+      </w:tr>
+    </w:tbl>
+    <w:p>
+      <w:pPr>
+        <w:spacing w:after="0"/>
+      </w:pPr>
+    </w:p>
+    <w:p>
+      <w:pPr>
+        <w:pStyle w:val="Heading1"/>
+      </w:pPr>
+      <w:r>
+        <w:t>9. ECD/ECF, ativo e depreciação</w:t>
+      </w:r>
+    </w:p>
+    <w:p>
+      <w:r>
+        <w:t>A ECD/ECF faz parte da operação atual. Conferir matriz, filiais, CNPJ, período, registros estruturais, validações internas e PVA; preservar arquivo transmitido, recibo e relatório de validação.</w:t>
+      </w:r>
+    </w:p>
+    <w:p>
+      <w:r>
+        <w:t>O módulo patrimonial cadastra bens, vida útil, valor residual e contas, acompanhando custo, depreciação acumulada e valor contábil. Aquisição, transferência entre contas, depreciação mensal e baixa possuem prévia contábil antes da escrituração.</w:t>
+      </w:r>
+    </w:p>
+    <w:tbl>
+      <w:tblPr>
+        <w:tblW w:type="dxa" w:w="9360"/>
+        <w:tblLayout w:type="fixed"/>
+        <w:tblLook w:firstColumn="1" w:firstRow="1" w:lastColumn="0" w:lastRow="0" w:noHBand="0" w:noVBand="1" w:val="04A0"/>
+        <w:tblInd w:w="120" w:type="dxa"/>
+      </w:tblPr>
+      <w:tblGrid>
+        <w:gridCol w:w="9360"/>
+      </w:tblGrid>
+      <w:tr>
+        <w:trPr>
+          <w:cantSplit/>
+        </w:trPr>
+        <w:tc>
+          <w:tcPr>
+            <w:tcW w:type="dxa" w:w="9360"/>
+            <w:tcMar>
+              <w:top w:w="80" w:type="dxa"/>
+              <w:start w:w="120" w:type="dxa"/>
+              <w:bottom w:w="80" w:type="dxa"/>
+              <w:end w:w="120" w:type="dxa"/>
+            </w:tcMar>
+            <w:shd w:fill="FFF7ED"/>
+          </w:tcPr>
+          <w:p>
+            <w:r>
+              <w:rPr>
+                <w:b/>
+                <w:color w:val="9A3412"/>
+              </w:rPr>
+              <w:t xml:space="preserve">Aprovação obrigatória: </w:t>
+            </w:r>
+            <w:r>
+              <w:t>A prévia não altera a escrituração. Confira competência, valores e contas de débito e crédito antes de aprovar cada evento. O CCI bloqueia duplicidade e impede lançamento em competência fechada.</w:t>
             </w:r>
           </w:p>
         </w:tc>
@@ -2598,7 +2751,7 @@
               <w:jc w:val="left"/>
             </w:pPr>
             <w:r>
-              <w:t>Conciliação bancária formal</w:t>
+              <w:t>Homologar conciliação bancária formal</w:t>
             </w:r>
           </w:p>
         </w:tc>
@@ -2619,7 +2772,7 @@
               <w:jc w:val="left"/>
             </w:pPr>
             <w:r>
-              <w:t>Saldo inicial + movimentos = saldo final por conta, sem diferença não justificada.</w:t>
+              <w:t>Saldo inicial + movimentos = saldo final por conta em empresas-piloto, sem diferença.</w:t>
             </w:r>
           </w:p>
         </w:tc>
@@ -2666,7 +2819,7 @@
               <w:jc w:val="left"/>
             </w:pPr>
             <w:r>
-              <w:t>Transporte de saldos e livro permanente</w:t>
+              <w:t>Homologar transporte de saldos</w:t>
             </w:r>
           </w:p>
         </w:tc>
@@ -2687,7 +2840,7 @@
               <w:jc w:val="left"/>
             </w:pPr>
             <w:r>
-              <w:t>Passagem entre competências/exercícios com autoria, versão e trilha auditável.</w:t>
+              <w:t>Passagem entre competências e dezembro/janeiro validada em fechamento real.</w:t>
             </w:r>
           </w:p>
         </w:tc>
@@ -2734,7 +2887,7 @@
               <w:jc w:val="left"/>
             </w:pPr>
             <w:r>
-              <w:t>Ativo integrado à escrituração</w:t>
+              <w:t>Homologar eventos do ativo</w:t>
             </w:r>
           </w:p>
         </w:tc>
@@ -2755,7 +2908,7 @@
               <w:jc w:val="left"/>
             </w:pPr>
             <w:r>
-              <w:t>Aquisição, depreciação, transferência e baixa geradas com prévia e aprovação.</w:t>
+              <w:t>Aquisição, transferência, depreciação e baixa aprovadas em empresa-piloto, com contas e valores conferidos.</w:t>
             </w:r>
           </w:p>
         </w:tc>
@@ -2948,11 +3101,6 @@
       </w:pPr>
     </w:p>
     <w:p>
-      <w:r>
-        <w:br w:type="page"/>
-      </w:r>
-    </w:p>
-    <w:p>
       <w:pPr>
         <w:pStyle w:val="Heading1"/>
       </w:pPr>
@@ -3083,7 +3231,7 @@
       <w:rPr>
         <w:sz w:val="16"/>
       </w:rPr>
-      <w:t>Uso interno  •  v2.7  •  18/08/2026</w:t>
+      <w:t>Uso interno  •  v2.8  •  18/08/2026</w:t>
     </w:r>
   </w:p>
 </w:ftr>

</xml_diff>

<commit_message>
fix(cci): restaurar depara e corrigir memoria em lote
</commit_message>
<xml_diff>
--- a/downloads/Manual_Operacional_CCI.docx
+++ b/downloads/Manual_Operacional_CCI.docx
@@ -55,7 +55,7 @@
           <w:color w:val="64748B"/>
           <w:sz w:val="20"/>
         </w:rPr>
-        <w:t>Versão 2.8  |  18 de agosto de 2026  |  Uso interno</w:t>
+        <w:t>Versão 2.9  |  19 de agosto de 2026  |  Uso interno</w:t>
       </w:r>
     </w:p>
     <w:p/>
@@ -1046,6 +1046,18 @@
         </w:numPr>
       </w:pPr>
       <w:r>
+        <w:t>Acesso direto e visível ao De/Para de Arquivos, para validar o relacionamento SAGE → CCI sem gravar lançamentos ou saldos.</w:t>
+      </w:r>
+    </w:p>
+    <w:p>
+      <w:pPr>
+        <w:spacing w:after="80" w:line="300" w:lineRule="auto"/>
+        <w:numPr>
+          <w:ilvl w:val="0"/>
+          <w:numId w:val="10"/>
+        </w:numPr>
+      </w:pPr>
+      <w:r>
         <w:t>Demonstrativo SAGE de impostos retidos em serviços prestados com linha bruta e linhas separadas de PIS, COFINS, CSLL, IRRF e INSS quando houver valor.</w:t>
       </w:r>
     </w:p>
@@ -1735,6 +1747,18 @@
       </w:pPr>
       <w:r>
         <w:t>A alteração em lote preserva data, valor, descrição e documento. Contas só podem ser aplicadas quando todos os selecionados tiverem a mesma natureza.</w:t>
+      </w:r>
+    </w:p>
+    <w:p>
+      <w:pPr>
+        <w:spacing w:after="80" w:line="300" w:lineRule="auto"/>
+        <w:numPr>
+          <w:ilvl w:val="0"/>
+          <w:numId w:val="10"/>
+        </w:numPr>
+      </w:pPr>
+      <w:r>
+        <w:t>Lançamentos já memorizados também podem ser corrigidos em lote. Para levar a correção às próximas importações, o administrador deve marcar Atualizar também a memória da empresa; a mudança é auditada e não ocorre silenciosamente.</w:t>
       </w:r>
     </w:p>
     <w:p>
@@ -3231,7 +3255,7 @@
       <w:rPr>
         <w:sz w:val="16"/>
       </w:rPr>
-      <w:t>Uso interno  •  v2.8  •  18/08/2026</w:t>
+      <w:t>Uso interno  •  v2.9  •  19/08/2026</w:t>
     </w:r>
   </w:p>
 </w:ftr>

</xml_diff>

<commit_message>
fix: processar extrato Itau imagem sem Gemini
</commit_message>
<xml_diff>
--- a/downloads/Manual_Operacional_CCI.docx
+++ b/downloads/Manual_Operacional_CCI.docx
@@ -1328,6 +1328,15 @@
         <w:ind w:left="270"/>
       </w:pPr>
       <w:r>
+        <w:t>☐ No Itaú, o leiaute Lançamentos por Período aceita PDF textual ou em imagem, executa OCR local e não depende do Gemini.</w:t>
+      </w:r>
+    </w:p>
+    <w:p>
+      <w:pPr>
+        <w:spacing w:after="80" w:line="300" w:lineRule="auto"/>
+        <w:ind w:left="270"/>
+      </w:pPr>
+      <w:r>
         <w:t>☐ Conferir período, conta bancária, quantidade de movimentos e totais.</w:t>
       </w:r>
     </w:p>
@@ -1434,10 +1443,10 @@
                 <w:b/>
                 <w:color w:val="9A3412"/>
               </w:rPr>
-              <w:t xml:space="preserve">Trava do Banco do Brasil: </w:t>
+              <w:t xml:space="preserve">Trava dos extratos em imagem: </w:t>
             </w:r>
             <w:r>
-              <w:t>Em PDF escaneado, o CCI reconstrói as linhas pela posição das palavras. A importação permanece bloqueada se saldo anterior + créditos - débitos não coincidir exatamente com o saldo final impresso.</w:t>
+              <w:t>Nos layouts homologados do Banco do Brasil e do Itaú, o CCI reconstrói as linhas pela posição das palavras. A importação permanece bloqueada se saldo anterior + créditos - débitos não coincidir exatamente com o saldo final impresso.</w:t>
             </w:r>
           </w:p>
         </w:tc>

</xml_diff>

<commit_message>
fix: importar ISS retido de servicos prestados
</commit_message>
<xml_diff>
--- a/downloads/Manual_Operacional_CCI.docx
+++ b/downloads/Manual_Operacional_CCI.docx
@@ -1498,6 +1498,15 @@
         <w:ind w:left="270"/>
       </w:pPr>
       <w:r>
+        <w:t>☐ Na Relação de NFs de Serviços Prestados, o CCI preserva base de cálculo, alíquota, valor do ISS e ISS retido; cada ISS retido não zerado gera uma linha própria vinculada à mesma NF e ao tomador.</w:t>
+      </w:r>
+    </w:p>
+    <w:p>
+      <w:pPr>
+        <w:spacing w:after="80" w:line="300" w:lineRule="auto"/>
+        <w:ind w:left="270"/>
+      </w:pPr>
+      <w:r>
         <w:t>☐ Para retenções sobre serviços tomados, abrir o modal independente Retenções Serviços Tomados. Ele está disponível para qualquer empresa ativa e aceita o Demonstrativo dos Impostos Retidos - Notas de Entradas de Serviços em PDF.</w:t>
       </w:r>
     </w:p>
@@ -1679,7 +1688,7 @@
               <w:t xml:space="preserve">Classificação contábil: </w:t>
             </w:r>
             <w:r>
-              <w:t>O CCI não inventa contas para os impostos. Débito, crédito e histórico devem vir do plano e das regras aprovadas para a empresa; somente depois a classificação pode ser memorizada.</w:t>
+              <w:t>O CCI não inventa contas para os impostos. Débito, crédito e histórico devem vir do plano e das regras aprovadas para a empresa; somente depois a classificação pode ser memorizada. No relatório de serviços prestados, confira se o total das linhas de ISS retido coincide com o total oficial impresso pela SAGE.</w:t>
             </w:r>
           </w:p>
         </w:tc>

</xml_diff>

<commit_message>
fix: conciliar relatorios de pagamentos
</commit_message>
<xml_diff>
--- a/downloads/Manual_Operacional_CCI.docx
+++ b/downloads/Manual_Operacional_CCI.docx
@@ -55,7 +55,7 @@
           <w:color w:val="64748B"/>
           <w:sz w:val="20"/>
         </w:rPr>
-        <w:t>Versão 2.9  |  19 de agosto de 2026  |  Uso interno</w:t>
+        <w:t>Versão 2.10  |  19 de agosto de 2026  |  Uso interno</w:t>
       </w:r>
     </w:p>
     <w:p/>
@@ -1879,6 +1879,24 @@
         <w:ind w:left="270"/>
       </w:pPr>
       <w:r>
+        <w:t>☐ No modal Conciliação de Arquivos, planilhas identificadas como Relatório Pagamentos tratam a coluna Valor como saída. A linha TOTAL não é importada como movimento.</w:t>
+      </w:r>
+    </w:p>
+    <w:p>
+      <w:pPr>
+        <w:spacing w:after="80" w:line="300" w:lineRule="auto"/>
+        <w:ind w:left="270"/>
+      </w:pPr>
+      <w:r>
+        <w:t>☐ Mesmo valor e sentido em datas diferentes por até 10 dias seguem para Revisão manual; somente o colaborador confirma a contraparte correta.</w:t>
+      </w:r>
+    </w:p>
+    <w:p>
+      <w:pPr>
+        <w:spacing w:after="80" w:line="300" w:lineRule="auto"/>
+        <w:ind w:left="270"/>
+      </w:pPr>
+      <w:r>
         <w:t>☐ Diferenças identificadas, justificadas e corrigidas antes do fechamento; conta já cadastrada para conciliação passa a ser obrigatória nos meses seguintes.</w:t>
       </w:r>
     </w:p>
@@ -3273,7 +3291,7 @@
       <w:rPr>
         <w:sz w:val="16"/>
       </w:rPr>
-      <w:t>Uso interno  •  v2.9  •  19/08/2026</w:t>
+      <w:t>Uso interno  •  v2.10  •  19/08/2026</w:t>
     </w:r>
   </w:p>
 </w:ftr>

</xml_diff>

<commit_message>
fix: extrair balancete no AuditAI sem Gemini
</commit_message>
<xml_diff>
--- a/downloads/Manual_Operacional_CCI.docx
+++ b/downloads/Manual_Operacional_CCI.docx
@@ -55,7 +55,7 @@
           <w:color w:val="64748B"/>
           <w:sz w:val="20"/>
         </w:rPr>
-        <w:t>Versão 2.10  |  19 de agosto de 2026  |  Uso interno</w:t>
+        <w:t>Versão 2.11  |  19 de agosto de 2026  |  Uso interno</w:t>
       </w:r>
     </w:p>
     <w:p/>
@@ -1897,6 +1897,15 @@
         <w:ind w:left="270"/>
       </w:pPr>
       <w:r>
+        <w:t>☐ No AuditAI, balancetes PDF com texto pesquisável são extraídos localmente. O CCI preserva contas, CNPJ, período e totais oficiais sem depender de créditos do Gemini; a IA fica como contingência para documentos em imagem e para pareceres complementares.</w:t>
+      </w:r>
+    </w:p>
+    <w:p>
+      <w:pPr>
+        <w:spacing w:after="80" w:line="300" w:lineRule="auto"/>
+        <w:ind w:left="270"/>
+      </w:pPr>
+      <w:r>
         <w:t>☐ Diferenças identificadas, justificadas e corrigidas antes do fechamento; conta já cadastrada para conciliação passa a ser obrigatória nos meses seguintes.</w:t>
       </w:r>
     </w:p>
@@ -3291,7 +3300,7 @@
       <w:rPr>
         <w:sz w:val="16"/>
       </w:rPr>
-      <w:t>Uso interno  •  v2.10  •  19/08/2026</w:t>
+      <w:t>Uso interno  •  v2.11  •  19/08/2026</w:t>
     </w:r>
   </w:p>
 </w:ftr>

</xml_diff>

<commit_message>
fix: restaurar AuditAI e servicos tomados
</commit_message>
<xml_diff>
--- a/downloads/Manual_Operacional_CCI.docx
+++ b/downloads/Manual_Operacional_CCI.docx
@@ -55,7 +55,7 @@
           <w:color w:val="64748B"/>
           <w:sz w:val="20"/>
         </w:rPr>
-        <w:t>Versão 2.11  |  19 de agosto de 2026  |  Uso interno</w:t>
+        <w:t>Versão 2.12  |  19 de agosto de 2026  |  Uso interno</w:t>
       </w:r>
     </w:p>
     <w:p/>
@@ -1087,6 +1087,30 @@
     </w:p>
     <w:p>
       <w:pPr>
+        <w:spacing w:after="80" w:line="300" w:lineRule="auto"/>
+        <w:numPr>
+          <w:ilvl w:val="0"/>
+          <w:numId w:val="10"/>
+        </w:numPr>
+      </w:pPr>
+      <w:r>
+        <w:t>AuditAI com totalização oficial de Ativo, Passivo, Circulante e Não Circulante, aba Balancete de quatro colunas e falha visível quando o parecer de IA estiver indisponível.</w:t>
+      </w:r>
+    </w:p>
+    <w:p>
+      <w:pPr>
+        <w:spacing w:after="80" w:line="300" w:lineRule="auto"/>
+        <w:numPr>
+          <w:ilvl w:val="0"/>
+          <w:numId w:val="10"/>
+        </w:numPr>
+      </w:pPr>
+      <w:r>
+        <w:t>Relação SAGE de Serviços Tomados aceita fornecedor identificado por CNPJ ou CPF e exige que todas as notas fechem com o total oficial.</w:t>
+      </w:r>
+    </w:p>
+    <w:p>
+      <w:pPr>
         <w:pStyle w:val="Heading1"/>
       </w:pPr>
       <w:r>
@@ -1898,6 +1922,24 @@
       </w:pPr>
       <w:r>
         <w:t>☐ No AuditAI, balancetes PDF com texto pesquisável são extraídos localmente. O CCI preserva contas, CNPJ, período e totais oficiais sem depender de créditos do Gemini; a IA fica como contingência para documentos em imagem e para pareceres complementares.</w:t>
+      </w:r>
+    </w:p>
+    <w:p>
+      <w:pPr>
+        <w:spacing w:after="80" w:line="300" w:lineRule="auto"/>
+        <w:ind w:left="270"/>
+      </w:pPr>
+      <w:r>
+        <w:t>☐ No AuditAI, usar a aba Balancete para conferir saldo anterior, débito, crédito e saldo atual. No Balanço, os subtotais e os totais gerais devem coincidir com as linhas oficiais do arquivo.</w:t>
+      </w:r>
+    </w:p>
+    <w:p>
+      <w:pPr>
+        <w:spacing w:after="80" w:line="300" w:lineRule="auto"/>
+        <w:ind w:left="270"/>
+      </w:pPr>
+      <w:r>
+        <w:t>☐ Se o provedor de IA estiver sem cota, o parecer deve mostrar aviso e opção Tentar novamente; os demonstrativos e valores permanecem disponíveis e não podem ficar em branco silenciosamente.</w:t>
       </w:r>
     </w:p>
     <w:p>
@@ -3300,7 +3342,7 @@
       <w:rPr>
         <w:sz w:val="16"/>
       </w:rPr>
-      <w:t>Uso interno  •  v2.11  •  19/08/2026</w:t>
+      <w:t>Uso interno  •  v2.12  •  19/08/2026</w:t>
     </w:r>
   </w:p>
 </w:ftr>

</xml_diff>

<commit_message>
feat: liberar saldos anteriores e edição auditável
</commit_message>
<xml_diff>
--- a/downloads/Manual_Operacional_CCI.docx
+++ b/downloads/Manual_Operacional_CCI.docx
@@ -55,7 +55,7 @@
           <w:color w:val="64748B"/>
           <w:sz w:val="20"/>
         </w:rPr>
-        <w:t>Versão 2.12  |  19 de agosto de 2026  |  Uso interno</w:t>
+        <w:t>Versão 2.13  |  19 de agosto de 2026  |  Uso interno</w:t>
       </w:r>
     </w:p>
     <w:p/>
@@ -1188,7 +1188,161 @@
         <w:pStyle w:val="Heading1"/>
       </w:pPr>
       <w:r>
-        <w:t>4. Fluxo mensal recomendado</w:t>
+        <w:t>4. Saldos anteriores e implantação da empresa</w:t>
+      </w:r>
+    </w:p>
+    <w:p>
+      <w:r>
+        <w:t>O saldo anterior representa a posição patrimonial imediatamente anterior ao início da escrituração no CCI. Ele não é uma nova importação bancária e não deve ser repetido em cada mês.</w:t>
+      </w:r>
+    </w:p>
+    <w:p>
+      <w:pPr>
+        <w:spacing w:after="80" w:line="300" w:lineRule="auto"/>
+        <w:numPr>
+          <w:ilvl w:val="0"/>
+          <w:numId w:val="11"/>
+        </w:numPr>
+      </w:pPr>
+      <w:r>
+        <w:t>Ativar a empresa e abrir Cadastro de Empresas.</w:t>
+      </w:r>
+    </w:p>
+    <w:p>
+      <w:pPr>
+        <w:spacing w:after="80" w:line="300" w:lineRule="auto"/>
+        <w:numPr>
+          <w:ilvl w:val="0"/>
+          <w:numId w:val="11"/>
+        </w:numPr>
+      </w:pPr>
+      <w:r>
+        <w:t>Definir Modo contábil como CCI — sistema único e conferir a data de início da escrituração.</w:t>
+      </w:r>
+    </w:p>
+    <w:p>
+      <w:pPr>
+        <w:spacing w:after="80" w:line="300" w:lineRule="auto"/>
+        <w:numPr>
+          <w:ilvl w:val="0"/>
+          <w:numId w:val="11"/>
+        </w:numPr>
+      </w:pPr>
+      <w:r>
+        <w:t>Abrir Contábil &gt; Saldos anteriores; o CCI selecionará automaticamente a competência inicial.</w:t>
+      </w:r>
+    </w:p>
+    <w:p>
+      <w:pPr>
+        <w:spacing w:after="80" w:line="300" w:lineRule="auto"/>
+        <w:numPr>
+          <w:ilvl w:val="0"/>
+          <w:numId w:val="11"/>
+        </w:numPr>
+      </w:pPr>
+      <w:r>
+        <w:t>Informar somente contas analíticas do plano ativo, uma por linha no formato conta;valor.</w:t>
+      </w:r>
+    </w:p>
+    <w:p>
+      <w:pPr>
+        <w:spacing w:after="80" w:line="300" w:lineRule="auto"/>
+        <w:numPr>
+          <w:ilvl w:val="0"/>
+          <w:numId w:val="11"/>
+        </w:numPr>
+      </w:pPr>
+      <w:r>
+        <w:t>Usar valor positivo para saldo devedor e negativo para saldo credor.</w:t>
+      </w:r>
+    </w:p>
+    <w:p>
+      <w:pPr>
+        <w:spacing w:after="80" w:line="300" w:lineRule="auto"/>
+        <w:numPr>
+          <w:ilvl w:val="0"/>
+          <w:numId w:val="11"/>
+        </w:numPr>
+      </w:pPr>
+      <w:r>
+        <w:t>Conferir quantidade, total devedor, total credor e diferença; a diferença deve ser zero.</w:t>
+      </w:r>
+    </w:p>
+    <w:p>
+      <w:pPr>
+        <w:spacing w:after="80" w:line="300" w:lineRule="auto"/>
+        <w:numPr>
+          <w:ilvl w:val="0"/>
+          <w:numId w:val="11"/>
+        </w:numPr>
+      </w:pPr>
+      <w:r>
+        <w:t>Salvar os saldos e aprovar a abertura. A aprovação somente fica disponível na competência inicial.</w:t>
+      </w:r>
+    </w:p>
+    <w:p>
+      <w:pPr>
+        <w:spacing w:after="80" w:line="300" w:lineRule="auto"/>
+        <w:numPr>
+          <w:ilvl w:val="0"/>
+          <w:numId w:val="11"/>
+        </w:numPr>
+      </w:pPr>
+      <w:r>
+        <w:t>Nos meses seguintes, utilizar o transporte automático produzido pelo fechamento; não recadastrar manualmente.</w:t>
+      </w:r>
+    </w:p>
+    <w:tbl>
+      <w:tblPr>
+        <w:tblW w:type="dxa" w:w="9360"/>
+        <w:tblLayout w:type="fixed"/>
+        <w:tblLook w:firstColumn="1" w:firstRow="1" w:lastColumn="0" w:lastRow="0" w:noHBand="0" w:noVBand="1" w:val="04A0"/>
+        <w:tblInd w:w="120" w:type="dxa"/>
+      </w:tblPr>
+      <w:tblGrid>
+        <w:gridCol w:w="9360"/>
+      </w:tblGrid>
+      <w:tr>
+        <w:trPr>
+          <w:cantSplit/>
+        </w:trPr>
+        <w:tc>
+          <w:tcPr>
+            <w:tcW w:type="dxa" w:w="9360"/>
+            <w:tcMar>
+              <w:top w:w="80" w:type="dxa"/>
+              <w:start w:w="120" w:type="dxa"/>
+              <w:bottom w:w="80" w:type="dxa"/>
+              <w:end w:w="120" w:type="dxa"/>
+            </w:tcMar>
+            <w:shd w:fill="FFF7ED"/>
+          </w:tcPr>
+          <w:p>
+            <w:r>
+              <w:rPr>
+                <w:b/>
+                <w:color w:val="9A3412"/>
+              </w:rPr>
+              <w:t xml:space="preserve">Travas: </w:t>
+            </w:r>
+            <w:r>
+              <w:t>O CCI rejeita conta inexistente, conta sintética, saldo vazio e abertura sem igualdade entre débitos e créditos. Período encerrado ou saldo transportado ficam protegidos contra alteração manual.</w:t>
+            </w:r>
+          </w:p>
+        </w:tc>
+      </w:tr>
+    </w:tbl>
+    <w:p>
+      <w:pPr>
+        <w:spacing w:after="0"/>
+      </w:pPr>
+    </w:p>
+    <w:p>
+      <w:pPr>
+        <w:pStyle w:val="Heading1"/>
+      </w:pPr>
+      <w:r>
+        <w:t>5. Fluxo mensal recomendado</w:t>
       </w:r>
     </w:p>
     <w:p>
@@ -1316,7 +1470,7 @@
         <w:pStyle w:val="Heading1"/>
       </w:pPr>
       <w:r>
-        <w:t>5. Importação de extrato bancário</w:t>
+        <w:t>6. Importação de extrato bancário</w:t>
       </w:r>
     </w:p>
     <w:p>
@@ -1486,7 +1640,7 @@
         <w:pStyle w:val="Heading1"/>
       </w:pPr>
       <w:r>
-        <w:t>5A. Importação de movimento fiscal</w:t>
+        <w:t>6A. Importação de movimento fiscal</w:t>
       </w:r>
     </w:p>
     <w:p>
@@ -1728,7 +1882,7 @@
         <w:pStyle w:val="Heading1"/>
       </w:pPr>
       <w:r>
-        <w:t>6. Classificação e memorização</w:t>
+        <w:t>7. Classificação e memorização</w:t>
       </w:r>
     </w:p>
     <w:p>
@@ -1800,6 +1954,30 @@
         </w:numPr>
       </w:pPr>
       <w:r>
+        <w:t>Cada lançamento recebe uma numeração permanente na empresa. Em Lançamentos, use o filtro Nº do lançamento para localizar diretamente um registro já importado.</w:t>
+      </w:r>
+    </w:p>
+    <w:p>
+      <w:pPr>
+        <w:spacing w:after="80" w:line="300" w:lineRule="auto"/>
+        <w:numPr>
+          <w:ilvl w:val="0"/>
+          <w:numId w:val="10"/>
+        </w:numPr>
+      </w:pPr>
+      <w:r>
+        <w:t>Para editar um lançamento existente, clique no lápis da linha. O CCI preserva a origem da importação, registra os valores anteriores, o usuário e a data da alteração, e bloqueia a edição quando a competência estiver encerrada.</w:t>
+      </w:r>
+    </w:p>
+    <w:p>
+      <w:pPr>
+        <w:spacing w:after="80" w:line="300" w:lineRule="auto"/>
+        <w:numPr>
+          <w:ilvl w:val="0"/>
+          <w:numId w:val="10"/>
+        </w:numPr>
+      </w:pPr>
+      <w:r>
         <w:t>Lançamentos já memorizados também podem ser corrigidos em lote. Para levar a correção às próximas importações, o administrador deve marcar Atualizar também a memória da empresa; a mudança é auditada e não ocorre silenciosamente.</w:t>
       </w:r>
     </w:p>
@@ -1844,7 +2022,7 @@
         <w:pStyle w:val="Heading1"/>
       </w:pPr>
       <w:r>
-        <w:t>7. Conciliação, relatórios e fechamento</w:t>
+        <w:t>8. Conciliação, relatórios e fechamento</w:t>
       </w:r>
     </w:p>
     <w:p>
@@ -2416,7 +2594,7 @@
         <w:pStyle w:val="Heading1"/>
       </w:pPr>
       <w:r>
-        <w:t>8. Regime tributário e parametrizações</w:t>
+        <w:t>9. Regime tributário e parametrizações</w:t>
       </w:r>
     </w:p>
     <w:p>
@@ -2540,7 +2718,7 @@
         <w:pStyle w:val="Heading1"/>
       </w:pPr>
       <w:r>
-        <w:t>9. ECD/ECF, ativo e depreciação</w:t>
+        <w:t>10. ECD/ECF, ativo e depreciação</w:t>
       </w:r>
     </w:p>
     <w:p>
@@ -2603,7 +2781,7 @@
         <w:pStyle w:val="Heading1"/>
       </w:pPr>
       <w:r>
-        <w:t>10. Permissões e segurança</w:t>
+        <w:t>11. Permissões e segurança</w:t>
       </w:r>
     </w:p>
     <w:p>
@@ -2664,7 +2842,7 @@
         <w:pStyle w:val="Heading1"/>
       </w:pPr>
       <w:r>
-        <w:t>11. Pendências para substituir definitivamente a SAGE</w:t>
+        <w:t>12. Pendências para substituir definitivamente a SAGE</w:t>
       </w:r>
     </w:p>
     <w:tbl>
@@ -3216,7 +3394,7 @@
         <w:pStyle w:val="Heading1"/>
       </w:pPr>
       <w:r>
-        <w:t>12. Próxima frente: divisão do trabalho</w:t>
+        <w:t>13. Próxima frente: divisão do trabalho</w:t>
       </w:r>
     </w:p>
     <w:p>
@@ -3342,7 +3520,7 @@
       <w:rPr>
         <w:sz w:val="16"/>
       </w:rPr>
-      <w:t>Uso interno  •  v2.12  •  19/08/2026</w:t>
+      <w:t>Uso interno  •  v2.13  •  19/08/2026</w:t>
     </w:r>
   </w:p>
 </w:ftr>

</xml_diff>

<commit_message>
feat: adicionar livros fiscais gerais da SAGE
</commit_message>
<xml_diff>
--- a/downloads/Manual_Operacional_CCI.docx
+++ b/downloads/Manual_Operacional_CCI.docx
@@ -55,7 +55,7 @@
           <w:color w:val="64748B"/>
           <w:sz w:val="20"/>
         </w:rPr>
-        <w:t>Versão 2.13  |  19 de agosto de 2026  |  Uso interno</w:t>
+        <w:t>Versão 2.14  |  19 de agosto de 2026  |  Uso interno</w:t>
       </w:r>
     </w:p>
     <w:p/>
@@ -1111,6 +1111,18 @@
     </w:p>
     <w:p>
       <w:pPr>
+        <w:spacing w:after="80" w:line="300" w:lineRule="auto"/>
+        <w:numPr>
+          <w:ilvl w:val="0"/>
+          <w:numId w:val="10"/>
+        </w:numPr>
+      </w:pPr>
+      <w:r>
+        <w:t>Modelos gerais de Livro de Entradas e Livro de Saídas da SAGE, disponíveis para qualquer empresa ativa, com direção fiscal, chaves, impostos, CFOP e identidade da empresa protegidos antes da gravação.</w:t>
+      </w:r>
+    </w:p>
+    <w:p>
+      <w:pPr>
         <w:pStyle w:val="Heading1"/>
       </w:pPr>
       <w:r>
@@ -1667,6 +1679,42 @@
         <w:ind w:left="270"/>
       </w:pPr>
       <w:r>
+        <w:t>☐ Para mercadorias e documentos fiscais da SAGE, selecionar Modelo geral — NF-e de entrada (compras) ou Modelo geral — NF-e de saída (vendas). Os dois modelos atendem todas as empresas.</w:t>
+      </w:r>
+    </w:p>
+    <w:p>
+      <w:pPr>
+        <w:spacing w:after="80" w:line="300" w:lineRule="auto"/>
+        <w:ind w:left="270"/>
+      </w:pPr>
+      <w:r>
+        <w:t>☐ No Livro de Entradas, manter o nome exportado no padrão NNNN_RelatorioNotas...; o código NNNN_ deve coincidir com o Nº da empresa informado no Cadastro do CCI.</w:t>
+      </w:r>
+    </w:p>
+    <w:p>
+      <w:pPr>
+        <w:spacing w:after="80" w:line="300" w:lineRule="auto"/>
+        <w:ind w:left="270"/>
+      </w:pPr>
+      <w:r>
+        <w:t>☐ No Livro de Saídas, o CCI extrai o CNPJ emitente das chaves NF-e e exige igualdade com o CNPJ da empresa ativa.</w:t>
+      </w:r>
+    </w:p>
+    <w:p>
+      <w:pPr>
+        <w:spacing w:after="80" w:line="300" w:lineRule="auto"/>
+        <w:ind w:left="270"/>
+      </w:pPr>
+      <w:r>
+        <w:t>☐ Conferir direção E/S, quantidade de notas, cobertura das chaves, período, CFOP, valor contábil e impostos destacados antes de continuar.</w:t>
+      </w:r>
+    </w:p>
+    <w:p>
+      <w:pPr>
+        <w:spacing w:after="80" w:line="300" w:lineRule="auto"/>
+        <w:ind w:left="270"/>
+      </w:pPr>
+      <w:r>
         <w:t>☐ Para o Demonstrativo de Impostos Retidos da SAGE, usar o modelo geral Impostos retidos em notas de serviços.</w:t>
       </w:r>
     </w:p>
@@ -1741,6 +1789,96 @@
       <w:r>
         <w:t>☐ Revisar a prévia antes de confirmar a gravação dos lançamentos.</w:t>
       </w:r>
+    </w:p>
+    <w:tbl>
+      <w:tblPr>
+        <w:tblW w:type="dxa" w:w="9360"/>
+        <w:tblLayout w:type="fixed"/>
+        <w:tblLook w:firstColumn="1" w:firstRow="1" w:lastColumn="0" w:lastRow="0" w:noHBand="0" w:noVBand="1" w:val="04A0"/>
+        <w:tblInd w:w="120" w:type="dxa"/>
+      </w:tblPr>
+      <w:tblGrid>
+        <w:gridCol w:w="9360"/>
+      </w:tblGrid>
+      <w:tr>
+        <w:trPr>
+          <w:cantSplit/>
+        </w:trPr>
+        <w:tc>
+          <w:tcPr>
+            <w:tcW w:type="dxa" w:w="9360"/>
+            <w:tcMar>
+              <w:top w:w="80" w:type="dxa"/>
+              <w:start w:w="120" w:type="dxa"/>
+              <w:bottom w:w="80" w:type="dxa"/>
+              <w:end w:w="120" w:type="dxa"/>
+            </w:tcMar>
+            <w:shd w:fill="FFF7ED"/>
+          </w:tcPr>
+          <w:p>
+            <w:r>
+              <w:rPr>
+                <w:b/>
+                <w:color w:val="9A3412"/>
+              </w:rPr>
+              <w:t xml:space="preserve">Livro de Entradas: </w:t>
+            </w:r>
+            <w:r>
+              <w:t>A chave NF-e de uma entrada identifica o fornecedor emitente, não a empresa compradora. Por isso, a trava segura usa o código NNNN_ do arquivo contra o Nº da empresa no cadastro ativo, além de exigir estrutura, direção E e cobertura das chaves. Não renomeie o arquivo removendo o código.</w:t>
+            </w:r>
+          </w:p>
+        </w:tc>
+      </w:tr>
+    </w:tbl>
+    <w:p>
+      <w:pPr>
+        <w:spacing w:after="0"/>
+      </w:pPr>
+    </w:p>
+    <w:tbl>
+      <w:tblPr>
+        <w:tblW w:type="dxa" w:w="9360"/>
+        <w:tblLayout w:type="fixed"/>
+        <w:tblLook w:firstColumn="1" w:firstRow="1" w:lastColumn="0" w:lastRow="0" w:noHBand="0" w:noVBand="1" w:val="04A0"/>
+        <w:tblInd w:w="120" w:type="dxa"/>
+      </w:tblPr>
+      <w:tblGrid>
+        <w:gridCol w:w="9360"/>
+      </w:tblGrid>
+      <w:tr>
+        <w:trPr>
+          <w:cantSplit/>
+        </w:trPr>
+        <w:tc>
+          <w:tcPr>
+            <w:tcW w:type="dxa" w:w="9360"/>
+            <w:tcMar>
+              <w:top w:w="80" w:type="dxa"/>
+              <w:start w:w="120" w:type="dxa"/>
+              <w:bottom w:w="80" w:type="dxa"/>
+              <w:end w:w="120" w:type="dxa"/>
+            </w:tcMar>
+            <w:shd w:fill="EFF6FF"/>
+          </w:tcPr>
+          <w:p>
+            <w:r>
+              <w:rPr>
+                <w:b/>
+                <w:color w:val="2454D7"/>
+              </w:rPr>
+              <w:t xml:space="preserve">Livro de Saídas: </w:t>
+            </w:r>
+            <w:r>
+              <w:t>Nas saídas, a chave NF-e contém o CNPJ da própria empresa emitente. Todas as notas devem possuir chave válida e apontar para um único CNPJ, idêntico ao cadastro ativo.</w:t>
+            </w:r>
+          </w:p>
+        </w:tc>
+      </w:tr>
+    </w:tbl>
+    <w:p>
+      <w:pPr>
+        <w:spacing w:after="0"/>
+      </w:pPr>
     </w:p>
     <w:tbl>
       <w:tblPr>
@@ -3520,7 +3658,7 @@
       <w:rPr>
         <w:sz w:val="16"/>
       </w:rPr>
-      <w:t>Uso interno  •  v2.13  •  19/08/2026</w:t>
+      <w:t>Uso interno  •  v2.14  •  19/08/2026</w:t>
     </w:r>
   </w:p>
 </w:ftr>

</xml_diff>

<commit_message>
docs: atualizar balanço do dia e pendências do CCI
</commit_message>
<xml_diff>
--- a/downloads/Manual_Operacional_CCI.docx
+++ b/downloads/Manual_Operacional_CCI.docx
@@ -55,7 +55,7 @@
           <w:color w:val="64748B"/>
           <w:sz w:val="20"/>
         </w:rPr>
-        <w:t>Versão 2.14  |  19 de agosto de 2026  |  Uso interno</w:t>
+        <w:t>Versão 2.15  |  19 de agosto de 2026  |  Uso interno</w:t>
       </w:r>
     </w:p>
     <w:p/>
@@ -93,7 +93,7 @@
               <w:t xml:space="preserve">Situação atual: </w:t>
             </w:r>
             <w:r>
-              <w:t>A operação cotidiana já cobre importações, classificação, relatórios, fechamento, conciliação bancária formal, transporte controlado de saldos, eventos contábeis do ativo imobilizado e ECD/ECF. A retirada definitiva da SAGE depende da homologação dessas rotinas em fechamentos-piloto e das validações operacionais finais.</w:t>
+              <w:t>A operação cotidiana já cobre importações, classificação, relatórios, fechamento, conciliação bancária formal, transporte controlado de saldos, eventos contábeis do ativo imobilizado e ECD/ECF. Em 19/08/2026 foram corrigidas nove frentes operacionais e adicionadas regressões com arquivos reais. A retirada definitiva da SAGE continua condicionada aos fechamentos-piloto, à recuperação de backup e às validações finais de operação.</w:t>
             </w:r>
           </w:p>
         </w:tc>
@@ -2980,7 +2980,680 @@
         <w:pStyle w:val="Heading1"/>
       </w:pPr>
       <w:r>
-        <w:t>12. Pendências para substituir definitivamente a SAGE</w:t>
+        <w:t>12. Balanço de 19/08/2026</w:t>
+      </w:r>
+    </w:p>
+    <w:p>
+      <w:r>
+        <w:t>O dia terminou com nove entregas publicadas, da v3.4.157 à v3.4.165. Os erros tratados foram reproduzidos com os arquivos enviados pelos colaboradores, transformados em testes permanentes e validados novamente no deploy.</w:t>
+      </w:r>
+    </w:p>
+    <w:tbl>
+      <w:tblPr>
+        <w:tblStyle w:val="TableGrid"/>
+        <w:tblW w:type="dxa" w:w="9360"/>
+        <w:tblLayout w:type="fixed"/>
+        <w:tblLook w:firstColumn="1" w:firstRow="1" w:lastColumn="0" w:lastRow="0" w:noHBand="0" w:noVBand="1" w:val="04A0"/>
+        <w:tblInd w:w="120" w:type="dxa"/>
+      </w:tblPr>
+      <w:tblGrid>
+        <w:gridCol w:w="2100"/>
+        <w:gridCol w:w="2460"/>
+        <w:gridCol w:w="4800"/>
+      </w:tblGrid>
+      <w:tr>
+        <w:trPr>
+          <w:cantSplit/>
+          <w:tblHeader/>
+        </w:trPr>
+        <w:tc>
+          <w:tcPr>
+            <w:tcW w:type="dxa" w:w="2100"/>
+            <w:tcMar>
+              <w:top w:w="80" w:type="dxa"/>
+              <w:start w:w="120" w:type="dxa"/>
+              <w:bottom w:w="80" w:type="dxa"/>
+              <w:end w:w="120" w:type="dxa"/>
+            </w:tcMar>
+            <w:vAlign w:val="center"/>
+            <w:shd w:fill="E8EEF5"/>
+          </w:tcPr>
+          <w:p>
+            <w:r>
+              <w:rPr>
+                <w:b/>
+                <w:color w:val="0B2545"/>
+              </w:rPr>
+              <w:t>Frente</w:t>
+            </w:r>
+          </w:p>
+        </w:tc>
+        <w:tc>
+          <w:tcPr>
+            <w:tcW w:type="dxa" w:w="2460"/>
+            <w:tcMar>
+              <w:top w:w="80" w:type="dxa"/>
+              <w:start w:w="120" w:type="dxa"/>
+              <w:bottom w:w="80" w:type="dxa"/>
+              <w:end w:w="120" w:type="dxa"/>
+            </w:tcMar>
+            <w:vAlign w:val="center"/>
+            <w:shd w:fill="E8EEF5"/>
+          </w:tcPr>
+          <w:p>
+            <w:r>
+              <w:rPr>
+                <w:b/>
+                <w:color w:val="0B2545"/>
+              </w:rPr>
+              <w:t>Resultado do dia</w:t>
+            </w:r>
+          </w:p>
+        </w:tc>
+        <w:tc>
+          <w:tcPr>
+            <w:tcW w:type="dxa" w:w="4800"/>
+            <w:tcMar>
+              <w:top w:w="80" w:type="dxa"/>
+              <w:start w:w="120" w:type="dxa"/>
+              <w:bottom w:w="80" w:type="dxa"/>
+              <w:end w:w="120" w:type="dxa"/>
+            </w:tcMar>
+            <w:vAlign w:val="center"/>
+            <w:shd w:fill="E8EEF5"/>
+          </w:tcPr>
+          <w:p>
+            <w:r>
+              <w:rPr>
+                <w:b/>
+                <w:color w:val="0B2545"/>
+              </w:rPr>
+              <w:t>Status</w:t>
+            </w:r>
+          </w:p>
+        </w:tc>
+      </w:tr>
+      <w:tr>
+        <w:trPr>
+          <w:cantSplit/>
+        </w:trPr>
+        <w:tc>
+          <w:tcPr>
+            <w:tcW w:type="dxa" w:w="2100"/>
+            <w:vAlign w:val="center"/>
+            <w:tcMar>
+              <w:top w:w="80" w:type="dxa"/>
+              <w:start w:w="120" w:type="dxa"/>
+              <w:bottom w:w="80" w:type="dxa"/>
+              <w:end w:w="120" w:type="dxa"/>
+            </w:tcMar>
+          </w:tcPr>
+          <w:p>
+            <w:pPr>
+              <w:ind w:left="0" w:firstLine="0"/>
+              <w:jc w:val="left"/>
+            </w:pPr>
+            <w:r>
+              <w:t>De/Para e memória</w:t>
+            </w:r>
+          </w:p>
+        </w:tc>
+        <w:tc>
+          <w:tcPr>
+            <w:tcW w:type="dxa" w:w="2460"/>
+            <w:vAlign w:val="center"/>
+            <w:tcMar>
+              <w:top w:w="80" w:type="dxa"/>
+              <w:start w:w="120" w:type="dxa"/>
+              <w:bottom w:w="80" w:type="dxa"/>
+              <w:end w:w="120" w:type="dxa"/>
+            </w:tcMar>
+          </w:tcPr>
+          <w:p>
+            <w:pPr>
+              <w:ind w:left="0" w:firstLine="0"/>
+              <w:jc w:val="left"/>
+            </w:pPr>
+            <w:r>
+              <w:t>Acesso restaurado e correção em lote permitida com auditoria.</w:t>
+            </w:r>
+          </w:p>
+        </w:tc>
+        <w:tc>
+          <w:tcPr>
+            <w:tcW w:type="dxa" w:w="4800"/>
+            <w:vAlign w:val="center"/>
+            <w:tcMar>
+              <w:top w:w="80" w:type="dxa"/>
+              <w:start w:w="120" w:type="dxa"/>
+              <w:bottom w:w="80" w:type="dxa"/>
+              <w:end w:w="120" w:type="dxa"/>
+            </w:tcMar>
+          </w:tcPr>
+          <w:p>
+            <w:pPr>
+              <w:ind w:left="0" w:firstLine="0"/>
+              <w:jc w:val="left"/>
+            </w:pPr>
+            <w:r>
+              <w:t>Publicado e testado</w:t>
+            </w:r>
+          </w:p>
+        </w:tc>
+      </w:tr>
+      <w:tr>
+        <w:trPr>
+          <w:cantSplit/>
+        </w:trPr>
+        <w:tc>
+          <w:tcPr>
+            <w:tcW w:type="dxa" w:w="2100"/>
+            <w:vAlign w:val="center"/>
+            <w:tcMar>
+              <w:top w:w="80" w:type="dxa"/>
+              <w:start w:w="120" w:type="dxa"/>
+              <w:bottom w:w="80" w:type="dxa"/>
+              <w:end w:w="120" w:type="dxa"/>
+            </w:tcMar>
+          </w:tcPr>
+          <w:p>
+            <w:pPr>
+              <w:ind w:left="0" w:firstLine="0"/>
+              <w:jc w:val="left"/>
+            </w:pPr>
+            <w:r>
+              <w:t>Extratos Itaú</w:t>
+            </w:r>
+          </w:p>
+        </w:tc>
+        <w:tc>
+          <w:tcPr>
+            <w:tcW w:type="dxa" w:w="2460"/>
+            <w:vAlign w:val="center"/>
+            <w:tcMar>
+              <w:top w:w="80" w:type="dxa"/>
+              <w:start w:w="120" w:type="dxa"/>
+              <w:bottom w:w="80" w:type="dxa"/>
+              <w:end w:w="120" w:type="dxa"/>
+            </w:tcMar>
+          </w:tcPr>
+          <w:p>
+            <w:pPr>
+              <w:ind w:left="0" w:firstLine="0"/>
+              <w:jc w:val="left"/>
+            </w:pPr>
+            <w:r>
+              <w:t>PDF em imagem processado localmente; FI confere sentido e conta bancária.</w:t>
+            </w:r>
+          </w:p>
+        </w:tc>
+        <w:tc>
+          <w:tcPr>
+            <w:tcW w:type="dxa" w:w="4800"/>
+            <w:vAlign w:val="center"/>
+            <w:tcMar>
+              <w:top w:w="80" w:type="dxa"/>
+              <w:start w:w="120" w:type="dxa"/>
+              <w:bottom w:w="80" w:type="dxa"/>
+              <w:end w:w="120" w:type="dxa"/>
+            </w:tcMar>
+          </w:tcPr>
+          <w:p>
+            <w:pPr>
+              <w:ind w:left="0" w:firstLine="0"/>
+              <w:jc w:val="left"/>
+            </w:pPr>
+            <w:r>
+              <w:t>Publicado e homologado com arquivos reais</w:t>
+            </w:r>
+          </w:p>
+        </w:tc>
+      </w:tr>
+      <w:tr>
+        <w:trPr>
+          <w:cantSplit/>
+        </w:trPr>
+        <w:tc>
+          <w:tcPr>
+            <w:tcW w:type="dxa" w:w="2100"/>
+            <w:vAlign w:val="center"/>
+            <w:tcMar>
+              <w:top w:w="80" w:type="dxa"/>
+              <w:start w:w="120" w:type="dxa"/>
+              <w:bottom w:w="80" w:type="dxa"/>
+              <w:end w:w="120" w:type="dxa"/>
+            </w:tcMar>
+          </w:tcPr>
+          <w:p>
+            <w:pPr>
+              <w:ind w:left="0" w:firstLine="0"/>
+              <w:jc w:val="left"/>
+            </w:pPr>
+            <w:r>
+              <w:t>Movimento fiscal</w:t>
+            </w:r>
+          </w:p>
+        </w:tc>
+        <w:tc>
+          <w:tcPr>
+            <w:tcW w:type="dxa" w:w="2460"/>
+            <w:vAlign w:val="center"/>
+            <w:tcMar>
+              <w:top w:w="80" w:type="dxa"/>
+              <w:start w:w="120" w:type="dxa"/>
+              <w:bottom w:w="80" w:type="dxa"/>
+              <w:end w:w="120" w:type="dxa"/>
+            </w:tcMar>
+          </w:tcPr>
+          <w:p>
+            <w:pPr>
+              <w:ind w:left="0" w:firstLine="0"/>
+              <w:jc w:val="left"/>
+            </w:pPr>
+            <w:r>
+              <w:t>ISS retido restaurado; Serviços Tomados aceita CPF; livros gerais de Entradas e Saídas criados.</w:t>
+            </w:r>
+          </w:p>
+        </w:tc>
+        <w:tc>
+          <w:tcPr>
+            <w:tcW w:type="dxa" w:w="4800"/>
+            <w:vAlign w:val="center"/>
+            <w:tcMar>
+              <w:top w:w="80" w:type="dxa"/>
+              <w:start w:w="120" w:type="dxa"/>
+              <w:bottom w:w="80" w:type="dxa"/>
+              <w:end w:w="120" w:type="dxa"/>
+            </w:tcMar>
+          </w:tcPr>
+          <w:p>
+            <w:pPr>
+              <w:ind w:left="0" w:firstLine="0"/>
+              <w:jc w:val="left"/>
+            </w:pPr>
+            <w:r>
+              <w:t>Publicado e testado</w:t>
+            </w:r>
+          </w:p>
+        </w:tc>
+      </w:tr>
+      <w:tr>
+        <w:trPr>
+          <w:cantSplit/>
+        </w:trPr>
+        <w:tc>
+          <w:tcPr>
+            <w:tcW w:type="dxa" w:w="2100"/>
+            <w:vAlign w:val="center"/>
+            <w:tcMar>
+              <w:top w:w="80" w:type="dxa"/>
+              <w:start w:w="120" w:type="dxa"/>
+              <w:bottom w:w="80" w:type="dxa"/>
+              <w:end w:w="120" w:type="dxa"/>
+            </w:tcMar>
+          </w:tcPr>
+          <w:p>
+            <w:pPr>
+              <w:ind w:left="0" w:firstLine="0"/>
+              <w:jc w:val="left"/>
+            </w:pPr>
+            <w:r>
+              <w:t>Conciliação</w:t>
+            </w:r>
+          </w:p>
+        </w:tc>
+        <w:tc>
+          <w:tcPr>
+            <w:tcW w:type="dxa" w:w="2460"/>
+            <w:vAlign w:val="center"/>
+            <w:tcMar>
+              <w:top w:w="80" w:type="dxa"/>
+              <w:start w:w="120" w:type="dxa"/>
+              <w:bottom w:w="80" w:type="dxa"/>
+              <w:end w:w="120" w:type="dxa"/>
+            </w:tcMar>
+          </w:tcPr>
+          <w:p>
+            <w:pPr>
+              <w:ind w:left="0" w:firstLine="0"/>
+              <w:jc w:val="left"/>
+            </w:pPr>
+            <w:r>
+              <w:t>Planilha de pagamentos passa a respeitar saídas e divergências de data vão para revisão manual.</w:t>
+            </w:r>
+          </w:p>
+        </w:tc>
+        <w:tc>
+          <w:tcPr>
+            <w:tcW w:type="dxa" w:w="4800"/>
+            <w:vAlign w:val="center"/>
+            <w:tcMar>
+              <w:top w:w="80" w:type="dxa"/>
+              <w:start w:w="120" w:type="dxa"/>
+              <w:bottom w:w="80" w:type="dxa"/>
+              <w:end w:w="120" w:type="dxa"/>
+            </w:tcMar>
+          </w:tcPr>
+          <w:p>
+            <w:pPr>
+              <w:ind w:left="0" w:firstLine="0"/>
+              <w:jc w:val="left"/>
+            </w:pPr>
+            <w:r>
+              <w:t>Motor publicado; falta fechamento-piloto</w:t>
+            </w:r>
+          </w:p>
+        </w:tc>
+      </w:tr>
+      <w:tr>
+        <w:trPr>
+          <w:cantSplit/>
+        </w:trPr>
+        <w:tc>
+          <w:tcPr>
+            <w:tcW w:type="dxa" w:w="2100"/>
+            <w:vAlign w:val="center"/>
+            <w:tcMar>
+              <w:top w:w="80" w:type="dxa"/>
+              <w:start w:w="120" w:type="dxa"/>
+              <w:bottom w:w="80" w:type="dxa"/>
+              <w:end w:w="120" w:type="dxa"/>
+            </w:tcMar>
+          </w:tcPr>
+          <w:p>
+            <w:pPr>
+              <w:ind w:left="0" w:firstLine="0"/>
+              <w:jc w:val="left"/>
+            </w:pPr>
+            <w:r>
+              <w:t>AuditAI</w:t>
+            </w:r>
+          </w:p>
+        </w:tc>
+        <w:tc>
+          <w:tcPr>
+            <w:tcW w:type="dxa" w:w="2460"/>
+            <w:vAlign w:val="center"/>
+            <w:tcMar>
+              <w:top w:w="80" w:type="dxa"/>
+              <w:start w:w="120" w:type="dxa"/>
+              <w:bottom w:w="80" w:type="dxa"/>
+              <w:end w:w="120" w:type="dxa"/>
+            </w:tcMar>
+          </w:tcPr>
+          <w:p>
+            <w:pPr>
+              <w:ind w:left="0" w:firstLine="0"/>
+              <w:jc w:val="left"/>
+            </w:pPr>
+            <w:r>
+              <w:t>Extração local do balancete, totais oficiais de Ativo/Passivo, aba Balancete e falha visível do parecer.</w:t>
+            </w:r>
+          </w:p>
+        </w:tc>
+        <w:tc>
+          <w:tcPr>
+            <w:tcW w:type="dxa" w:w="4800"/>
+            <w:vAlign w:val="center"/>
+            <w:tcMar>
+              <w:top w:w="80" w:type="dxa"/>
+              <w:start w:w="120" w:type="dxa"/>
+              <w:bottom w:w="80" w:type="dxa"/>
+              <w:end w:w="120" w:type="dxa"/>
+            </w:tcMar>
+          </w:tcPr>
+          <w:p>
+            <w:pPr>
+              <w:ind w:left="0" w:firstLine="0"/>
+              <w:jc w:val="left"/>
+            </w:pPr>
+            <w:r>
+              <w:t>Publicado; falta homologação operacional ampliada</w:t>
+            </w:r>
+          </w:p>
+        </w:tc>
+      </w:tr>
+      <w:tr>
+        <w:trPr>
+          <w:cantSplit/>
+        </w:trPr>
+        <w:tc>
+          <w:tcPr>
+            <w:tcW w:type="dxa" w:w="2100"/>
+            <w:vAlign w:val="center"/>
+            <w:tcMar>
+              <w:top w:w="80" w:type="dxa"/>
+              <w:start w:w="120" w:type="dxa"/>
+              <w:bottom w:w="80" w:type="dxa"/>
+              <w:end w:w="120" w:type="dxa"/>
+            </w:tcMar>
+          </w:tcPr>
+          <w:p>
+            <w:pPr>
+              <w:ind w:left="0" w:firstLine="0"/>
+              <w:jc w:val="left"/>
+            </w:pPr>
+            <w:r>
+              <w:t>Implantação</w:t>
+            </w:r>
+          </w:p>
+        </w:tc>
+        <w:tc>
+          <w:tcPr>
+            <w:tcW w:type="dxa" w:w="2460"/>
+            <w:vAlign w:val="center"/>
+            <w:tcMar>
+              <w:top w:w="80" w:type="dxa"/>
+              <w:start w:w="120" w:type="dxa"/>
+              <w:bottom w:w="80" w:type="dxa"/>
+              <w:end w:w="120" w:type="dxa"/>
+            </w:tcMar>
+          </w:tcPr>
+          <w:p>
+            <w:pPr>
+              <w:ind w:left="0" w:firstLine="0"/>
+              <w:jc w:val="left"/>
+            </w:pPr>
+            <w:r>
+              <w:t>Saldos anteriores acessíveis e aprovação liberada na competência inicial; lançamento importado pode ser localizado e editado.</w:t>
+            </w:r>
+          </w:p>
+        </w:tc>
+        <w:tc>
+          <w:tcPr>
+            <w:tcW w:type="dxa" w:w="4800"/>
+            <w:vAlign w:val="center"/>
+            <w:tcMar>
+              <w:top w:w="80" w:type="dxa"/>
+              <w:start w:w="120" w:type="dxa"/>
+              <w:bottom w:w="80" w:type="dxa"/>
+              <w:end w:w="120" w:type="dxa"/>
+            </w:tcMar>
+          </w:tcPr>
+          <w:p>
+            <w:pPr>
+              <w:ind w:left="0" w:firstLine="0"/>
+              <w:jc w:val="left"/>
+            </w:pPr>
+            <w:r>
+              <w:t>Publicado; falta uso em empresa-piloto</w:t>
+            </w:r>
+          </w:p>
+        </w:tc>
+      </w:tr>
+      <w:tr>
+        <w:trPr>
+          <w:cantSplit/>
+        </w:trPr>
+        <w:tc>
+          <w:tcPr>
+            <w:tcW w:type="dxa" w:w="2100"/>
+            <w:vAlign w:val="center"/>
+            <w:tcMar>
+              <w:top w:w="80" w:type="dxa"/>
+              <w:start w:w="120" w:type="dxa"/>
+              <w:bottom w:w="80" w:type="dxa"/>
+              <w:end w:w="120" w:type="dxa"/>
+            </w:tcMar>
+          </w:tcPr>
+          <w:p>
+            <w:pPr>
+              <w:ind w:left="0" w:firstLine="0"/>
+              <w:jc w:val="left"/>
+            </w:pPr>
+            <w:r>
+              <w:t>Qualidade</w:t>
+            </w:r>
+          </w:p>
+        </w:tc>
+        <w:tc>
+          <w:tcPr>
+            <w:tcW w:type="dxa" w:w="2460"/>
+            <w:vAlign w:val="center"/>
+            <w:tcMar>
+              <w:top w:w="80" w:type="dxa"/>
+              <w:start w:w="120" w:type="dxa"/>
+              <w:bottom w:w="80" w:type="dxa"/>
+              <w:end w:w="120" w:type="dxa"/>
+            </w:tcMar>
+          </w:tcPr>
+          <w:p>
+            <w:pPr>
+              <w:ind w:left="0" w:firstLine="0"/>
+              <w:jc w:val="left"/>
+            </w:pPr>
+            <w:r>
+              <w:t>Suíte integral aprovada e arquivos reais incorporados às regressões.</w:t>
+            </w:r>
+          </w:p>
+        </w:tc>
+        <w:tc>
+          <w:tcPr>
+            <w:tcW w:type="dxa" w:w="4800"/>
+            <w:vAlign w:val="center"/>
+            <w:tcMar>
+              <w:top w:w="80" w:type="dxa"/>
+              <w:start w:w="120" w:type="dxa"/>
+              <w:bottom w:w="80" w:type="dxa"/>
+              <w:end w:w="120" w:type="dxa"/>
+            </w:tcMar>
+          </w:tcPr>
+          <w:p>
+            <w:pPr>
+              <w:ind w:left="0" w:firstLine="0"/>
+              <w:jc w:val="left"/>
+            </w:pPr>
+            <w:r>
+              <w:t>Controle contínuo ativo</w:t>
+            </w:r>
+          </w:p>
+        </w:tc>
+      </w:tr>
+    </w:tbl>
+    <w:p>
+      <w:pPr>
+        <w:spacing w:after="0"/>
+      </w:pPr>
+    </w:p>
+    <w:p>
+      <w:pPr>
+        <w:spacing w:after="80" w:line="300" w:lineRule="auto"/>
+        <w:numPr>
+          <w:ilvl w:val="0"/>
+          <w:numId w:val="10"/>
+        </w:numPr>
+      </w:pPr>
+      <w:r>
+        <w:t>Nenhum lançamento, empresa ou memória existente foi excluído automaticamente durante as correções.</w:t>
+      </w:r>
+    </w:p>
+    <w:p>
+      <w:pPr>
+        <w:spacing w:after="80" w:line="300" w:lineRule="auto"/>
+        <w:numPr>
+          <w:ilvl w:val="0"/>
+          <w:numId w:val="10"/>
+        </w:numPr>
+      </w:pPr>
+      <w:r>
+        <w:t>Erros técnicos do provedor de IA deixaram de ser apresentados como se fossem erro do arquivo quando existe processamento local homologado.</w:t>
+      </w:r>
+    </w:p>
+    <w:p>
+      <w:pPr>
+        <w:spacing w:after="80" w:line="300" w:lineRule="auto"/>
+        <w:numPr>
+          <w:ilvl w:val="0"/>
+          <w:numId w:val="10"/>
+        </w:numPr>
+      </w:pPr>
+      <w:r>
+        <w:t>A validação passou a comparar conteúdo importado, arquivo FI e relatório da SAGE antes de concluir a correção.</w:t>
+      </w:r>
+    </w:p>
+    <w:p>
+      <w:pPr>
+        <w:spacing w:after="80" w:line="300" w:lineRule="auto"/>
+        <w:numPr>
+          <w:ilvl w:val="0"/>
+          <w:numId w:val="10"/>
+        </w:numPr>
+      </w:pPr>
+      <w:r>
+        <w:t>Novidades, versão do aplicativo e testes foram atualizados junto com cada publicação.</w:t>
+      </w:r>
+    </w:p>
+    <w:tbl>
+      <w:tblPr>
+        <w:tblW w:type="dxa" w:w="9360"/>
+        <w:tblLayout w:type="fixed"/>
+        <w:tblLook w:firstColumn="1" w:firstRow="1" w:lastColumn="0" w:lastRow="0" w:noHBand="0" w:noVBand="1" w:val="04A0"/>
+        <w:tblInd w:w="120" w:type="dxa"/>
+      </w:tblPr>
+      <w:tblGrid>
+        <w:gridCol w:w="9360"/>
+      </w:tblGrid>
+      <w:tr>
+        <w:trPr>
+          <w:cantSplit/>
+        </w:trPr>
+        <w:tc>
+          <w:tcPr>
+            <w:tcW w:type="dxa" w:w="9360"/>
+            <w:tcMar>
+              <w:top w:w="80" w:type="dxa"/>
+              <w:start w:w="120" w:type="dxa"/>
+              <w:bottom w:w="80" w:type="dxa"/>
+              <w:end w:w="120" w:type="dxa"/>
+            </w:tcMar>
+            <w:shd w:fill="FFF7ED"/>
+          </w:tcPr>
+          <w:p>
+            <w:r>
+              <w:rPr>
+                <w:b/>
+                <w:color w:val="9A3412"/>
+              </w:rPr>
+              <w:t xml:space="preserve">Status da substituição da SAGE: </w:t>
+            </w:r>
+            <w:r>
+              <w:t>A cobertura funcional é alta, mas a virada definitiva ainda não está autorizada. O próximo ganho real depende de escolher empresas-piloto, aprovar saldos de abertura e completar fechamentos mensais consecutivos, incluindo conciliação, transporte e ativo.</w:t>
+            </w:r>
+          </w:p>
+        </w:tc>
+      </w:tr>
+    </w:tbl>
+    <w:p>
+      <w:pPr>
+        <w:spacing w:after="0"/>
+      </w:pPr>
+    </w:p>
+    <w:p>
+      <w:pPr>
+        <w:pStyle w:val="Heading1"/>
+      </w:pPr>
+      <w:r>
+        <w:t>13. Pendências atualizadas para substituir definitivamente a SAGE</w:t>
       </w:r>
     </w:p>
     <w:tbl>
@@ -3110,7 +3783,7 @@
               <w:jc w:val="left"/>
             </w:pPr>
             <w:r>
-              <w:t>Empresas-piloto exclusivas no CCI</w:t>
+              <w:t>A INICIAR — empresas-piloto exclusivas no CCI</w:t>
             </w:r>
           </w:p>
         </w:tc>
@@ -3131,7 +3804,7 @@
               <w:jc w:val="left"/>
             </w:pPr>
             <w:r>
-              <w:t>Dados de abertura, regime, plano, históricos e competência aprovados.</w:t>
+              <w:t>Selecionar 2 ou 3 empresas; aprovar dados de abertura, regime, plano, históricos e competência.</w:t>
             </w:r>
           </w:p>
         </w:tc>
@@ -3178,7 +3851,7 @@
               <w:jc w:val="left"/>
             </w:pPr>
             <w:r>
-              <w:t>Homologar conciliação bancária formal</w:t>
+              <w:t>EM HOMOLOGAÇÃO — conciliação bancária formal</w:t>
             </w:r>
           </w:p>
         </w:tc>
@@ -3199,7 +3872,7 @@
               <w:jc w:val="left"/>
             </w:pPr>
             <w:r>
-              <w:t>Saldo inicial + movimentos = saldo final por conta em empresas-piloto, sem diferença.</w:t>
+              <w:t>Motor implementado; comprovar saldo inicial + movimentos = saldo final por conta em fechamentos reais.</w:t>
             </w:r>
           </w:p>
         </w:tc>
@@ -3246,7 +3919,7 @@
               <w:jc w:val="left"/>
             </w:pPr>
             <w:r>
-              <w:t>Homologar transporte de saldos</w:t>
+              <w:t>EM HOMOLOGAÇÃO — transporte de saldos</w:t>
             </w:r>
           </w:p>
         </w:tc>
@@ -3267,7 +3940,7 @@
               <w:jc w:val="left"/>
             </w:pPr>
             <w:r>
-              <w:t>Passagem entre competências e dezembro/janeiro validada em fechamento real.</w:t>
+              <w:t>Motor e regressões aprovados; validar passagem entre competências e dezembro/janeiro em fechamento real.</w:t>
             </w:r>
           </w:p>
         </w:tc>
@@ -3314,7 +3987,7 @@
               <w:jc w:val="left"/>
             </w:pPr>
             <w:r>
-              <w:t>Homologar eventos do ativo</w:t>
+              <w:t>EM HOMOLOGAÇÃO — eventos do ativo</w:t>
             </w:r>
           </w:p>
         </w:tc>
@@ -3335,7 +4008,7 @@
               <w:jc w:val="left"/>
             </w:pPr>
             <w:r>
-              <w:t>Aquisição, transferência, depreciação e baixa aprovadas em empresa-piloto, com contas e valores conferidos.</w:t>
+              <w:t>Integração implementada; aprovar aquisição, transferência, depreciação e baixa em empresa-piloto.</w:t>
             </w:r>
           </w:p>
         </w:tc>
@@ -3382,7 +4055,7 @@
               <w:jc w:val="left"/>
             </w:pPr>
             <w:r>
-              <w:t>Homologação operacional</w:t>
+              <w:t>PENDENTE — backup e recuperação operacional</w:t>
             </w:r>
           </w:p>
         </w:tc>
@@ -3403,7 +4076,7 @@
               <w:jc w:val="left"/>
             </w:pPr>
             <w:r>
-              <w:t>Backup/restauração, múltiplos usuários, permissões, falhas e volume testados.</w:t>
+              <w:t>Definir Firestore + cópia externa, agenda, retenção e executar teste documentado de restauração; validar múltiplos usuários e volume.</w:t>
             </w:r>
           </w:p>
         </w:tc>
@@ -3450,7 +4123,7 @@
               <w:jc w:val="left"/>
             </w:pPr>
             <w:r>
-              <w:t>Virada</w:t>
+              <w:t>PENDENTE — virada definitiva</w:t>
             </w:r>
           </w:p>
         </w:tc>
@@ -3471,7 +4144,7 @@
               <w:jc w:val="left"/>
             </w:pPr>
             <w:r>
-              <w:t>Dois ou três fechamentos consecutivos aprovados e sem pendência crítica.</w:t>
+              <w:t>Concluir dois ou três fechamentos consecutivos, revisar relatórios e encerrar todas as pendências críticas.</w:t>
             </w:r>
           </w:p>
         </w:tc>
@@ -3532,7 +4205,7 @@
         <w:pStyle w:val="Heading1"/>
       </w:pPr>
       <w:r>
-        <w:t>13. Próxima frente: divisão do trabalho</w:t>
+        <w:t>14. Próxima frente: divisão do trabalho</w:t>
       </w:r>
     </w:p>
     <w:p>
@@ -3658,7 +4331,7 @@
       <w:rPr>
         <w:sz w:val="16"/>
       </w:rPr>
-      <w:t>Uso interno  •  v2.14  •  19/08/2026</w:t>
+      <w:t>Uso interno  •  v2.15  •  19/08/2026</w:t>
     </w:r>
   </w:p>
 </w:ftr>

</xml_diff>

<commit_message>
feat: acompanhar homologacao das empresas piloto
</commit_message>
<xml_diff>
--- a/downloads/Manual_Operacional_CCI.docx
+++ b/downloads/Manual_Operacional_CCI.docx
@@ -55,7 +55,7 @@
           <w:color w:val="64748B"/>
           <w:sz w:val="20"/>
         </w:rPr>
-        <w:t>Versão 2.15  |  19 de agosto de 2026  |  Uso interno</w:t>
+        <w:t>Versão 2.16  |  20 de agosto de 2026  |  Uso interno</w:t>
       </w:r>
     </w:p>
     <w:p/>
@@ -93,7 +93,7 @@
               <w:t xml:space="preserve">Situação atual: </w:t>
             </w:r>
             <w:r>
-              <w:t>A operação cotidiana já cobre importações, classificação, relatórios, fechamento, conciliação bancária formal, transporte controlado de saldos, eventos contábeis do ativo imobilizado e ECD/ECF. Em 19/08/2026 foram corrigidas nove frentes operacionais e adicionadas regressões com arquivos reais. A retirada definitiva da SAGE continua condicionada aos fechamentos-piloto, à recuperação de backup e às validações finais de operação.</w:t>
+              <w:t>A operação cotidiana já cobre importações, classificação, relatórios, fechamento, conciliação bancária formal, transporte controlado de saldos, eventos contábeis do ativo imobilizado e ECD/ECF. Em 20/08/2026 o CCI passou a calcular o roteiro de homologação de cada empresa-piloto com evidências gravadas no próprio sistema. A retirada definitiva da SAGE continua condicionada aos fechamentos-piloto, à recuperação de backup e às validações finais de operação.</w:t>
             </w:r>
           </w:p>
         </w:tc>
@@ -866,7 +866,120 @@
         <w:pStyle w:val="Heading1"/>
       </w:pPr>
       <w:r>
-        <w:t>2. Entregas concluídas em 18/08/2026</w:t>
+        <w:t>2. Entregas concluídas em 20/08/2026</w:t>
+      </w:r>
+    </w:p>
+    <w:p>
+      <w:pPr>
+        <w:spacing w:after="80" w:line="300" w:lineRule="auto"/>
+        <w:numPr>
+          <w:ilvl w:val="0"/>
+          <w:numId w:val="10"/>
+        </w:numPr>
+      </w:pPr>
+      <w:r>
+        <w:t>Novo roteiro da empresa-piloto dentro dos Relatórios Contábeis, com percentual e próxima ação.</w:t>
+      </w:r>
+    </w:p>
+    <w:p>
+      <w:pPr>
+        <w:spacing w:after="80" w:line="300" w:lineRule="auto"/>
+        <w:numPr>
+          <w:ilvl w:val="0"/>
+          <w:numId w:val="10"/>
+        </w:numPr>
+      </w:pPr>
+      <w:r>
+        <w:t>A homologação usa evidências gravadas: configuração, abertura, fechamentos consecutivos, conciliações, transportes e eventos do ativo.</w:t>
+      </w:r>
+    </w:p>
+    <w:p>
+      <w:pPr>
+        <w:spacing w:after="80" w:line="300" w:lineRule="auto"/>
+        <w:numPr>
+          <w:ilvl w:val="0"/>
+          <w:numId w:val="10"/>
+        </w:numPr>
+      </w:pPr>
+      <w:r>
+        <w:t>Nenhuma etapa pode ser aprovada manualmente pelo painel; o status muda somente quando a operação correspondente é concluída no CCI.</w:t>
+      </w:r>
+    </w:p>
+    <w:p>
+      <w:pPr>
+        <w:spacing w:after="80" w:line="300" w:lineRule="auto"/>
+        <w:numPr>
+          <w:ilvl w:val="0"/>
+          <w:numId w:val="10"/>
+        </w:numPr>
+      </w:pPr>
+      <w:r>
+        <w:t>Empresas sem bens cadastrados recebem Ativo imobilizado como etapa não aplicável, sem reduzir artificialmente a prontidão.</w:t>
+      </w:r>
+    </w:p>
+    <w:p>
+      <w:pPr>
+        <w:spacing w:after="80" w:line="300" w:lineRule="auto"/>
+        <w:numPr>
+          <w:ilvl w:val="0"/>
+          <w:numId w:val="10"/>
+        </w:numPr>
+      </w:pPr>
+      <w:r>
+        <w:t>Isenta, Imune e Terceiro Setor passaram a ser reconhecidos também pelo cálculo geral de prontidão contábil, alinhado às parametrizações já existentes.</w:t>
+      </w:r>
+    </w:p>
+    <w:tbl>
+      <w:tblPr>
+        <w:tblW w:type="dxa" w:w="9360"/>
+        <w:tblLayout w:type="fixed"/>
+        <w:tblLook w:firstColumn="1" w:firstRow="1" w:lastColumn="0" w:lastRow="0" w:noHBand="0" w:noVBand="1" w:val="04A0"/>
+        <w:tblInd w:w="120" w:type="dxa"/>
+      </w:tblPr>
+      <w:tblGrid>
+        <w:gridCol w:w="9360"/>
+      </w:tblGrid>
+      <w:tr>
+        <w:trPr>
+          <w:cantSplit/>
+        </w:trPr>
+        <w:tc>
+          <w:tcPr>
+            <w:tcW w:type="dxa" w:w="9360"/>
+            <w:tcMar>
+              <w:top w:w="80" w:type="dxa"/>
+              <w:start w:w="120" w:type="dxa"/>
+              <w:bottom w:w="80" w:type="dxa"/>
+              <w:end w:w="120" w:type="dxa"/>
+            </w:tcMar>
+            <w:shd w:fill="FFF7ED"/>
+          </w:tcPr>
+          <w:p>
+            <w:r>
+              <w:rPr>
+                <w:b/>
+                <w:color w:val="9A3412"/>
+              </w:rPr>
+              <w:t xml:space="preserve">Critério de virada: </w:t>
+            </w:r>
+            <w:r>
+              <w:t>O percentual da empresa-piloto não autoriza sozinho a retirada da SAGE. A decisão final continua dependendo dos fechamentos reais, recuperação de backup, múltiplos usuários e validação do responsável contábil.</w:t>
+            </w:r>
+          </w:p>
+        </w:tc>
+      </w:tr>
+    </w:tbl>
+    <w:p>
+      <w:pPr>
+        <w:spacing w:after="0"/>
+      </w:pPr>
+    </w:p>
+    <w:p>
+      <w:pPr>
+        <w:pStyle w:val="Heading1"/>
+      </w:pPr>
+      <w:r>
+        <w:t>2.1 Entregas concluídas em 18/08/2026</w:t>
       </w:r>
     </w:p>
     <w:p>
@@ -4331,7 +4444,7 @@
       <w:rPr>
         <w:sz w:val="16"/>
       </w:rPr>
-      <w:t>Uso interno  •  v2.15  •  19/08/2026</w:t>
+      <w:t>Uso interno  •  v2.16  •  20/08/2026</w:t>
     </w:r>
   </w:p>
 </w:ftr>

</xml_diff>

<commit_message>
Libera importacao de folha aos colaboradores
</commit_message>
<xml_diff>
--- a/downloads/Manual_Operacional_CCI.docx
+++ b/downloads/Manual_Operacional_CCI.docx
@@ -55,7 +55,7 @@
           <w:color w:val="64748B"/>
           <w:sz w:val="20"/>
         </w:rPr>
-        <w:t>Versão 2.16  |  20 de agosto de 2026  |  Uso interno</w:t>
+        <w:t>Versão 2.17  |  20 de agosto de 2026  |  Uso interno</w:t>
       </w:r>
     </w:p>
     <w:p/>
@@ -929,6 +929,18 @@
         <w:t>Isenta, Imune e Terceiro Setor passaram a ser reconhecidos também pelo cálculo geral de prontidão contábil, alinhado às parametrizações já existentes.</w:t>
       </w:r>
     </w:p>
+    <w:p>
+      <w:pPr>
+        <w:spacing w:after="80" w:line="300" w:lineRule="auto"/>
+        <w:numPr>
+          <w:ilvl w:val="0"/>
+          <w:numId w:val="10"/>
+        </w:numPr>
+      </w:pPr>
+      <w:r>
+        <w:t>Importar Folha passou a ficar disponível para todos os colaboradores autenticados, sempre limitado às empresas da carteira do usuário; vincular empresa e excluir cadastros continuam sendo funções administrativas.</w:t>
+      </w:r>
+    </w:p>
     <w:tbl>
       <w:tblPr>
         <w:tblW w:type="dxa" w:w="9360"/>
@@ -4444,7 +4456,7 @@
       <w:rPr>
         <w:sz w:val="16"/>
       </w:rPr>
-      <w:t>Uso interno  •  v2.16  •  20/08/2026</w:t>
+      <w:t>Uso interno  •  v2.17  •  20/08/2026</w:t>
     </w:r>
   </w:p>
 </w:ftr>

</xml_diff>

<commit_message>
feat: importar folha SAGE FPIMP no CCI
</commit_message>
<xml_diff>
--- a/downloads/Manual_Operacional_CCI.docx
+++ b/downloads/Manual_Operacional_CCI.docx
@@ -55,7 +55,7 @@
           <w:color w:val="64748B"/>
           <w:sz w:val="20"/>
         </w:rPr>
-        <w:t>Versão 2.17  |  20 de agosto de 2026  |  Uso interno</w:t>
+        <w:t>Versão 2.18  |  20 de agosto de 2026  |  Uso interno</w:t>
       </w:r>
     </w:p>
     <w:p/>
@@ -941,6 +941,18 @@
         <w:t>Importar Folha passou a ficar disponível para todos os colaboradores autenticados, sempre limitado às empresas da carteira do usuário; vincular empresa e excluir cadastros continuam sendo funções administrativas.</w:t>
       </w:r>
     </w:p>
+    <w:p>
+      <w:pPr>
+        <w:spacing w:after="80" w:line="300" w:lineRule="auto"/>
+        <w:numPr>
+          <w:ilvl w:val="0"/>
+          <w:numId w:val="10"/>
+        </w:numPr>
+      </w:pPr>
+      <w:r>
+        <w:t>O arquivo contábil da SAGE Folha no padrão FPIMP + código da empresa + .mês é reconhecido diretamente pelo CCI. Antes da conferência e gravação, o sistema valida o código da empresa, o mês do arquivo, a competência ativa, o layout fixo, as contas, o histórico, o valor e a duplicidade.</w:t>
+      </w:r>
+    </w:p>
     <w:tbl>
       <w:tblPr>
         <w:tblW w:type="dxa" w:w="9360"/>
@@ -4456,7 +4468,7 @@
       <w:rPr>
         <w:sz w:val="16"/>
       </w:rPr>
-      <w:t>Uso interno  •  v2.17  •  20/08/2026</w:t>
+      <w:t>Uso interno  •  v2.18  •  20/08/2026</w:t>
     </w:r>
   </w:p>
 </w:ftr>

</xml_diff>